<commit_message>
06 RFS: stage IV 제외 복원 (exclude_stage = 4)
ad77828에서 NaN으로 바뀌어 RFS에 stage IV가 포함되던 문제.
RFS n 557 → 497 (사건 177 → 140), CLAUDE.md 기준값과 일치. OS 결과는 변화 없음.

Co-Authored-By: Claude Opus 5.5 <noreply@anthropic.com>
</commit_message>
<xml_diff>
--- a/output/tables/GEO/GSE39582/GSE39582_cox_RFS.docx
+++ b/output/tables/GEO/GSE39582/GSE39582_cox_RFS.docx
@@ -710,7 +710,7 @@
                 <w:szCs w:val="18"/>
                 <w:color w:val="000000"/>
               </w:rPr>
-              <w:t xml:space="preserve">279</w:t>
+              <w:t xml:space="preserve">245</w:t>
             </w:r>
           </w:p>
         </w:tc>
@@ -765,7 +765,7 @@
                 <w:szCs w:val="18"/>
                 <w:color w:val="000000"/>
               </w:rPr>
-              <w:t xml:space="preserve">105</w:t>
+              <w:t xml:space="preserve">84</w:t>
             </w:r>
           </w:p>
         </w:tc>
@@ -1155,7 +1155,7 @@
                 <w:szCs w:val="18"/>
                 <w:color w:val="000000"/>
               </w:rPr>
-              <w:t xml:space="preserve">278</w:t>
+              <w:t xml:space="preserve">252</w:t>
             </w:r>
           </w:p>
         </w:tc>
@@ -1210,117 +1210,117 @@
                 <w:szCs w:val="18"/>
                 <w:color w:val="000000"/>
               </w:rPr>
-              <w:t xml:space="preserve">72</w:t>
-            </w:r>
-          </w:p>
-        </w:tc>
-        <w:tc>
-          <w:tcPr>
-            <w:tcBorders>
-              <w:bottom w:val="none" w:sz="0" w:space="0" w:color="000000"/>
-              <w:top w:val="none" w:sz="0" w:space="0" w:color="000000"/>
-              <w:left w:val="none" w:sz="0" w:space="0" w:color="000000"/>
-              <w:right w:val="none" w:sz="0" w:space="0" w:color="000000"/>
-            </w:tcBorders>
-            <w:shd w:val="clear" w:color="auto" w:fill="FFFFFF"/>
-            <w:tcMar>
-              <w:top w:w="0" w:type="dxa"/>
-              <w:bottom w:w="0" w:type="dxa"/>
-              <w:left w:w="0" w:type="dxa"/>
-              <w:right w:w="0" w:type="dxa"/>
-            </w:tcMar>
-            <w:vAlign w:val="center"/>
-          </w:tcPr>
-          <w:p>
-            <w:pPr>
-              <w:pStyle w:val="Normal"/>
-              <w:jc w:val="left"/>
-              <w:pBdr>
-                <w:bottom w:val="none" w:sz="0" w:space="0" w:color="000000"/>
-                <w:top w:val="none" w:sz="0" w:space="0" w:color="000000"/>
-                <w:left w:val="none" w:sz="0" w:space="0" w:color="000000"/>
-                <w:right w:val="none" w:sz="0" w:space="0" w:color="000000"/>
-              </w:pBdr>
-              <w:spacing w:after="100" w:before="100" w:line="240"/>
-              <w:ind w:left="100" w:right="100" w:firstLine="0" w:firstLineChars="0"/>
-              <w:rPr>
-                <w:rFonts w:ascii="Times New Roman" w:hAnsi="Times New Roman" w:eastAsia="Times New Roman" w:cs="Times New Roman"/>
-                <w:i w:val="false"/>
-                <w:b w:val="false"/>
-                <w:u w:val="none"/>
-                <w:strike w:val="false"/>
-                <w:sz w:val="18"/>
-                <w:szCs w:val="18"/>
-                <w:color w:val="000000"/>
-              </w:rPr>
-            </w:pPr>
-            <w:r>
-              <w:rPr>
-                <w:rFonts w:ascii="Times New Roman" w:hAnsi="Times New Roman" w:eastAsia="Times New Roman" w:cs="Times New Roman"/>
-                <w:i w:val="false"/>
-                <w:b w:val="false"/>
-                <w:u w:val="none"/>
-                <w:strike w:val="false"/>
-                <w:sz w:val="18"/>
-                <w:szCs w:val="18"/>
-                <w:color w:val="000000"/>
-              </w:rPr>
-              <w:t xml:space="preserve">0.66 (0.49–0.89)</w:t>
-            </w:r>
-          </w:p>
-        </w:tc>
-        <w:tc>
-          <w:tcPr>
-            <w:tcBorders>
-              <w:bottom w:val="none" w:sz="0" w:space="0" w:color="000000"/>
-              <w:top w:val="none" w:sz="0" w:space="0" w:color="000000"/>
-              <w:left w:val="none" w:sz="0" w:space="0" w:color="000000"/>
-              <w:right w:val="none" w:sz="0" w:space="0" w:color="000000"/>
-            </w:tcBorders>
-            <w:shd w:val="clear" w:color="auto" w:fill="FFFFFF"/>
-            <w:tcMar>
-              <w:top w:w="0" w:type="dxa"/>
-              <w:bottom w:w="0" w:type="dxa"/>
-              <w:left w:w="0" w:type="dxa"/>
-              <w:right w:w="0" w:type="dxa"/>
-            </w:tcMar>
-            <w:vAlign w:val="center"/>
-          </w:tcPr>
-          <w:p>
-            <w:pPr>
-              <w:pStyle w:val="Normal"/>
-              <w:jc w:val="left"/>
-              <w:pBdr>
-                <w:bottom w:val="none" w:sz="0" w:space="0" w:color="000000"/>
-                <w:top w:val="none" w:sz="0" w:space="0" w:color="000000"/>
-                <w:left w:val="none" w:sz="0" w:space="0" w:color="000000"/>
-                <w:right w:val="none" w:sz="0" w:space="0" w:color="000000"/>
-              </w:pBdr>
-              <w:spacing w:after="100" w:before="100" w:line="240"/>
-              <w:ind w:left="100" w:right="100" w:firstLine="0" w:firstLineChars="0"/>
-              <w:rPr>
-                <w:rFonts w:ascii="Times New Roman" w:hAnsi="Times New Roman" w:eastAsia="Times New Roman" w:cs="Times New Roman"/>
-                <w:i w:val="false"/>
-                <w:b w:val="false"/>
-                <w:u w:val="none"/>
-                <w:strike w:val="false"/>
-                <w:sz w:val="18"/>
-                <w:szCs w:val="18"/>
-                <w:color w:val="000000"/>
-              </w:rPr>
-            </w:pPr>
-            <w:r>
-              <w:rPr>
-                <w:rFonts w:ascii="Times New Roman" w:hAnsi="Times New Roman" w:eastAsia="Times New Roman" w:cs="Times New Roman"/>
-                <w:i w:val="false"/>
-                <w:b w:val="false"/>
-                <w:u w:val="none"/>
-                <w:strike w:val="false"/>
-                <w:sz w:val="18"/>
-                <w:szCs w:val="18"/>
-                <w:color w:val="000000"/>
-              </w:rPr>
-              <w:t xml:space="preserve">0.006</w:t>
+              <w:t xml:space="preserve">56</w:t>
+            </w:r>
+          </w:p>
+        </w:tc>
+        <w:tc>
+          <w:tcPr>
+            <w:tcBorders>
+              <w:bottom w:val="none" w:sz="0" w:space="0" w:color="000000"/>
+              <w:top w:val="none" w:sz="0" w:space="0" w:color="000000"/>
+              <w:left w:val="none" w:sz="0" w:space="0" w:color="000000"/>
+              <w:right w:val="none" w:sz="0" w:space="0" w:color="000000"/>
+            </w:tcBorders>
+            <w:shd w:val="clear" w:color="auto" w:fill="FFFFFF"/>
+            <w:tcMar>
+              <w:top w:w="0" w:type="dxa"/>
+              <w:bottom w:w="0" w:type="dxa"/>
+              <w:left w:w="0" w:type="dxa"/>
+              <w:right w:w="0" w:type="dxa"/>
+            </w:tcMar>
+            <w:vAlign w:val="center"/>
+          </w:tcPr>
+          <w:p>
+            <w:pPr>
+              <w:pStyle w:val="Normal"/>
+              <w:jc w:val="left"/>
+              <w:pBdr>
+                <w:bottom w:val="none" w:sz="0" w:space="0" w:color="000000"/>
+                <w:top w:val="none" w:sz="0" w:space="0" w:color="000000"/>
+                <w:left w:val="none" w:sz="0" w:space="0" w:color="000000"/>
+                <w:right w:val="none" w:sz="0" w:space="0" w:color="000000"/>
+              </w:pBdr>
+              <w:spacing w:after="100" w:before="100" w:line="240"/>
+              <w:ind w:left="100" w:right="100" w:firstLine="0" w:firstLineChars="0"/>
+              <w:rPr>
+                <w:rFonts w:ascii="Times New Roman" w:hAnsi="Times New Roman" w:eastAsia="Times New Roman" w:cs="Times New Roman"/>
+                <w:i w:val="false"/>
+                <w:b w:val="false"/>
+                <w:u w:val="none"/>
+                <w:strike w:val="false"/>
+                <w:sz w:val="18"/>
+                <w:szCs w:val="18"/>
+                <w:color w:val="000000"/>
+              </w:rPr>
+            </w:pPr>
+            <w:r>
+              <w:rPr>
+                <w:rFonts w:ascii="Times New Roman" w:hAnsi="Times New Roman" w:eastAsia="Times New Roman" w:cs="Times New Roman"/>
+                <w:i w:val="false"/>
+                <w:b w:val="false"/>
+                <w:u w:val="none"/>
+                <w:strike w:val="false"/>
+                <w:sz w:val="18"/>
+                <w:szCs w:val="18"/>
+                <w:color w:val="000000"/>
+              </w:rPr>
+              <w:t xml:space="preserve">0.63 (0.45–0.88)</w:t>
+            </w:r>
+          </w:p>
+        </w:tc>
+        <w:tc>
+          <w:tcPr>
+            <w:tcBorders>
+              <w:bottom w:val="none" w:sz="0" w:space="0" w:color="000000"/>
+              <w:top w:val="none" w:sz="0" w:space="0" w:color="000000"/>
+              <w:left w:val="none" w:sz="0" w:space="0" w:color="000000"/>
+              <w:right w:val="none" w:sz="0" w:space="0" w:color="000000"/>
+            </w:tcBorders>
+            <w:shd w:val="clear" w:color="auto" w:fill="FFFFFF"/>
+            <w:tcMar>
+              <w:top w:w="0" w:type="dxa"/>
+              <w:bottom w:w="0" w:type="dxa"/>
+              <w:left w:w="0" w:type="dxa"/>
+              <w:right w:w="0" w:type="dxa"/>
+            </w:tcMar>
+            <w:vAlign w:val="center"/>
+          </w:tcPr>
+          <w:p>
+            <w:pPr>
+              <w:pStyle w:val="Normal"/>
+              <w:jc w:val="left"/>
+              <w:pBdr>
+                <w:bottom w:val="none" w:sz="0" w:space="0" w:color="000000"/>
+                <w:top w:val="none" w:sz="0" w:space="0" w:color="000000"/>
+                <w:left w:val="none" w:sz="0" w:space="0" w:color="000000"/>
+                <w:right w:val="none" w:sz="0" w:space="0" w:color="000000"/>
+              </w:pBdr>
+              <w:spacing w:after="100" w:before="100" w:line="240"/>
+              <w:ind w:left="100" w:right="100" w:firstLine="0" w:firstLineChars="0"/>
+              <w:rPr>
+                <w:rFonts w:ascii="Times New Roman" w:hAnsi="Times New Roman" w:eastAsia="Times New Roman" w:cs="Times New Roman"/>
+                <w:i w:val="false"/>
+                <w:b w:val="false"/>
+                <w:u w:val="none"/>
+                <w:strike w:val="false"/>
+                <w:sz w:val="18"/>
+                <w:szCs w:val="18"/>
+                <w:color w:val="000000"/>
+              </w:rPr>
+            </w:pPr>
+            <w:r>
+              <w:rPr>
+                <w:rFonts w:ascii="Times New Roman" w:hAnsi="Times New Roman" w:eastAsia="Times New Roman" w:cs="Times New Roman"/>
+                <w:i w:val="false"/>
+                <w:b w:val="false"/>
+                <w:u w:val="none"/>
+                <w:strike w:val="false"/>
+                <w:sz w:val="18"/>
+                <w:szCs w:val="18"/>
+                <w:color w:val="000000"/>
+              </w:rPr>
+              <w:t xml:space="preserve">0.007</w:t>
             </w:r>
           </w:p>
         </w:tc>
@@ -1600,7 +1600,7 @@
                 <w:szCs w:val="18"/>
                 <w:color w:val="000000"/>
               </w:rPr>
-              <w:t xml:space="preserve">557</w:t>
+              <w:t xml:space="preserve">497</w:t>
             </w:r>
           </w:p>
         </w:tc>
@@ -1655,62 +1655,62 @@
                 <w:szCs w:val="18"/>
                 <w:color w:val="000000"/>
               </w:rPr>
-              <w:t xml:space="preserve">177</w:t>
-            </w:r>
-          </w:p>
-        </w:tc>
-        <w:tc>
-          <w:tcPr>
-            <w:tcBorders>
-              <w:bottom w:val="none" w:sz="0" w:space="0" w:color="000000"/>
-              <w:top w:val="none" w:sz="0" w:space="0" w:color="000000"/>
-              <w:left w:val="none" w:sz="0" w:space="0" w:color="000000"/>
-              <w:right w:val="none" w:sz="0" w:space="0" w:color="000000"/>
-            </w:tcBorders>
-            <w:shd w:val="clear" w:color="auto" w:fill="FFFFFF"/>
-            <w:tcMar>
-              <w:top w:w="0" w:type="dxa"/>
-              <w:bottom w:w="0" w:type="dxa"/>
-              <w:left w:w="0" w:type="dxa"/>
-              <w:right w:w="0" w:type="dxa"/>
-            </w:tcMar>
-            <w:vAlign w:val="center"/>
-          </w:tcPr>
-          <w:p>
-            <w:pPr>
-              <w:pStyle w:val="Normal"/>
-              <w:jc w:val="left"/>
-              <w:pBdr>
-                <w:bottom w:val="none" w:sz="0" w:space="0" w:color="000000"/>
-                <w:top w:val="none" w:sz="0" w:space="0" w:color="000000"/>
-                <w:left w:val="none" w:sz="0" w:space="0" w:color="000000"/>
-                <w:right w:val="none" w:sz="0" w:space="0" w:color="000000"/>
-              </w:pBdr>
-              <w:spacing w:after="100" w:before="100" w:line="240"/>
-              <w:ind w:left="100" w:right="100" w:firstLine="0" w:firstLineChars="0"/>
-              <w:rPr>
-                <w:rFonts w:ascii="Times New Roman" w:hAnsi="Times New Roman" w:eastAsia="Times New Roman" w:cs="Times New Roman"/>
-                <w:i w:val="false"/>
-                <w:b w:val="false"/>
-                <w:u w:val="none"/>
-                <w:strike w:val="false"/>
-                <w:sz w:val="18"/>
-                <w:szCs w:val="18"/>
-                <w:color w:val="000000"/>
-              </w:rPr>
-            </w:pPr>
-            <w:r>
-              <w:rPr>
-                <w:rFonts w:ascii="Times New Roman" w:hAnsi="Times New Roman" w:eastAsia="Times New Roman" w:cs="Times New Roman"/>
-                <w:i w:val="false"/>
-                <w:b w:val="false"/>
-                <w:u w:val="none"/>
-                <w:strike w:val="false"/>
-                <w:sz w:val="18"/>
-                <w:szCs w:val="18"/>
-                <w:color w:val="000000"/>
-              </w:rPr>
-              <w:t xml:space="preserve">0.76 (0.65–0.88)</w:t>
+              <w:t xml:space="preserve">140</w:t>
+            </w:r>
+          </w:p>
+        </w:tc>
+        <w:tc>
+          <w:tcPr>
+            <w:tcBorders>
+              <w:bottom w:val="none" w:sz="0" w:space="0" w:color="000000"/>
+              <w:top w:val="none" w:sz="0" w:space="0" w:color="000000"/>
+              <w:left w:val="none" w:sz="0" w:space="0" w:color="000000"/>
+              <w:right w:val="none" w:sz="0" w:space="0" w:color="000000"/>
+            </w:tcBorders>
+            <w:shd w:val="clear" w:color="auto" w:fill="FFFFFF"/>
+            <w:tcMar>
+              <w:top w:w="0" w:type="dxa"/>
+              <w:bottom w:w="0" w:type="dxa"/>
+              <w:left w:w="0" w:type="dxa"/>
+              <w:right w:w="0" w:type="dxa"/>
+            </w:tcMar>
+            <w:vAlign w:val="center"/>
+          </w:tcPr>
+          <w:p>
+            <w:pPr>
+              <w:pStyle w:val="Normal"/>
+              <w:jc w:val="left"/>
+              <w:pBdr>
+                <w:bottom w:val="none" w:sz="0" w:space="0" w:color="000000"/>
+                <w:top w:val="none" w:sz="0" w:space="0" w:color="000000"/>
+                <w:left w:val="none" w:sz="0" w:space="0" w:color="000000"/>
+                <w:right w:val="none" w:sz="0" w:space="0" w:color="000000"/>
+              </w:pBdr>
+              <w:spacing w:after="100" w:before="100" w:line="240"/>
+              <w:ind w:left="100" w:right="100" w:firstLine="0" w:firstLineChars="0"/>
+              <w:rPr>
+                <w:rFonts w:ascii="Times New Roman" w:hAnsi="Times New Roman" w:eastAsia="Times New Roman" w:cs="Times New Roman"/>
+                <w:i w:val="false"/>
+                <w:b w:val="false"/>
+                <w:u w:val="none"/>
+                <w:strike w:val="false"/>
+                <w:sz w:val="18"/>
+                <w:szCs w:val="18"/>
+                <w:color w:val="000000"/>
+              </w:rPr>
+            </w:pPr>
+            <w:r>
+              <w:rPr>
+                <w:rFonts w:ascii="Times New Roman" w:hAnsi="Times New Roman" w:eastAsia="Times New Roman" w:cs="Times New Roman"/>
+                <w:i w:val="false"/>
+                <w:b w:val="false"/>
+                <w:u w:val="none"/>
+                <w:strike w:val="false"/>
+                <w:sz w:val="18"/>
+                <w:szCs w:val="18"/>
+                <w:color w:val="000000"/>
+              </w:rPr>
+              <w:t xml:space="preserve">0.73 (0.61–0.86)</w:t>
             </w:r>
           </w:p>
         </w:tc>
@@ -2045,7 +2045,7 @@
                 <w:szCs w:val="18"/>
                 <w:color w:val="000000"/>
               </w:rPr>
-              <w:t xml:space="preserve">552</w:t>
+              <w:t xml:space="preserve">492</w:t>
             </w:r>
           </w:p>
         </w:tc>
@@ -2100,117 +2100,117 @@
                 <w:szCs w:val="18"/>
                 <w:color w:val="000000"/>
               </w:rPr>
-              <w:t xml:space="preserve">177</w:t>
-            </w:r>
-          </w:p>
-        </w:tc>
-        <w:tc>
-          <w:tcPr>
-            <w:tcBorders>
-              <w:bottom w:val="none" w:sz="0" w:space="0" w:color="000000"/>
-              <w:top w:val="none" w:sz="0" w:space="0" w:color="000000"/>
-              <w:left w:val="none" w:sz="0" w:space="0" w:color="000000"/>
-              <w:right w:val="none" w:sz="0" w:space="0" w:color="000000"/>
-            </w:tcBorders>
-            <w:shd w:val="clear" w:color="auto" w:fill="FFFFFF"/>
-            <w:tcMar>
-              <w:top w:w="0" w:type="dxa"/>
-              <w:bottom w:w="0" w:type="dxa"/>
-              <w:left w:w="0" w:type="dxa"/>
-              <w:right w:w="0" w:type="dxa"/>
-            </w:tcMar>
-            <w:vAlign w:val="center"/>
-          </w:tcPr>
-          <w:p>
-            <w:pPr>
-              <w:pStyle w:val="Normal"/>
-              <w:jc w:val="left"/>
-              <w:pBdr>
-                <w:bottom w:val="none" w:sz="0" w:space="0" w:color="000000"/>
-                <w:top w:val="none" w:sz="0" w:space="0" w:color="000000"/>
-                <w:left w:val="none" w:sz="0" w:space="0" w:color="000000"/>
-                <w:right w:val="none" w:sz="0" w:space="0" w:color="000000"/>
-              </w:pBdr>
-              <w:spacing w:after="100" w:before="100" w:line="240"/>
-              <w:ind w:left="100" w:right="100" w:firstLine="0" w:firstLineChars="0"/>
-              <w:rPr>
-                <w:rFonts w:ascii="Times New Roman" w:hAnsi="Times New Roman" w:eastAsia="Times New Roman" w:cs="Times New Roman"/>
-                <w:i w:val="false"/>
-                <w:b w:val="false"/>
-                <w:u w:val="none"/>
-                <w:strike w:val="false"/>
-                <w:sz w:val="18"/>
-                <w:szCs w:val="18"/>
-                <w:color w:val="000000"/>
-              </w:rPr>
-            </w:pPr>
-            <w:r>
-              <w:rPr>
-                <w:rFonts w:ascii="Times New Roman" w:hAnsi="Times New Roman" w:eastAsia="Times New Roman" w:cs="Times New Roman"/>
-                <w:i w:val="false"/>
-                <w:b w:val="false"/>
-                <w:u w:val="none"/>
-                <w:strike w:val="false"/>
-                <w:sz w:val="18"/>
-                <w:szCs w:val="18"/>
-                <w:color w:val="000000"/>
-              </w:rPr>
-              <w:t xml:space="preserve">0.80 (0.68–0.94)</w:t>
-            </w:r>
-          </w:p>
-        </w:tc>
-        <w:tc>
-          <w:tcPr>
-            <w:tcBorders>
-              <w:bottom w:val="none" w:sz="0" w:space="0" w:color="000000"/>
-              <w:top w:val="none" w:sz="0" w:space="0" w:color="000000"/>
-              <w:left w:val="none" w:sz="0" w:space="0" w:color="000000"/>
-              <w:right w:val="none" w:sz="0" w:space="0" w:color="000000"/>
-            </w:tcBorders>
-            <w:shd w:val="clear" w:color="auto" w:fill="FFFFFF"/>
-            <w:tcMar>
-              <w:top w:w="0" w:type="dxa"/>
-              <w:bottom w:w="0" w:type="dxa"/>
-              <w:left w:w="0" w:type="dxa"/>
-              <w:right w:w="0" w:type="dxa"/>
-            </w:tcMar>
-            <w:vAlign w:val="center"/>
-          </w:tcPr>
-          <w:p>
-            <w:pPr>
-              <w:pStyle w:val="Normal"/>
-              <w:jc w:val="left"/>
-              <w:pBdr>
-                <w:bottom w:val="none" w:sz="0" w:space="0" w:color="000000"/>
-                <w:top w:val="none" w:sz="0" w:space="0" w:color="000000"/>
-                <w:left w:val="none" w:sz="0" w:space="0" w:color="000000"/>
-                <w:right w:val="none" w:sz="0" w:space="0" w:color="000000"/>
-              </w:pBdr>
-              <w:spacing w:after="100" w:before="100" w:line="240"/>
-              <w:ind w:left="100" w:right="100" w:firstLine="0" w:firstLineChars="0"/>
-              <w:rPr>
-                <w:rFonts w:ascii="Times New Roman" w:hAnsi="Times New Roman" w:eastAsia="Times New Roman" w:cs="Times New Roman"/>
-                <w:i w:val="false"/>
-                <w:b w:val="false"/>
-                <w:u w:val="none"/>
-                <w:strike w:val="false"/>
-                <w:sz w:val="18"/>
-                <w:szCs w:val="18"/>
-                <w:color w:val="000000"/>
-              </w:rPr>
-            </w:pPr>
-            <w:r>
-              <w:rPr>
-                <w:rFonts w:ascii="Times New Roman" w:hAnsi="Times New Roman" w:eastAsia="Times New Roman" w:cs="Times New Roman"/>
-                <w:i w:val="false"/>
-                <w:b w:val="false"/>
-                <w:u w:val="none"/>
-                <w:strike w:val="false"/>
-                <w:sz w:val="18"/>
-                <w:szCs w:val="18"/>
-                <w:color w:val="000000"/>
-              </w:rPr>
-              <w:t xml:space="preserve">0.006</w:t>
+              <w:t xml:space="preserve">140</w:t>
+            </w:r>
+          </w:p>
+        </w:tc>
+        <w:tc>
+          <w:tcPr>
+            <w:tcBorders>
+              <w:bottom w:val="none" w:sz="0" w:space="0" w:color="000000"/>
+              <w:top w:val="none" w:sz="0" w:space="0" w:color="000000"/>
+              <w:left w:val="none" w:sz="0" w:space="0" w:color="000000"/>
+              <w:right w:val="none" w:sz="0" w:space="0" w:color="000000"/>
+            </w:tcBorders>
+            <w:shd w:val="clear" w:color="auto" w:fill="FFFFFF"/>
+            <w:tcMar>
+              <w:top w:w="0" w:type="dxa"/>
+              <w:bottom w:w="0" w:type="dxa"/>
+              <w:left w:w="0" w:type="dxa"/>
+              <w:right w:w="0" w:type="dxa"/>
+            </w:tcMar>
+            <w:vAlign w:val="center"/>
+          </w:tcPr>
+          <w:p>
+            <w:pPr>
+              <w:pStyle w:val="Normal"/>
+              <w:jc w:val="left"/>
+              <w:pBdr>
+                <w:bottom w:val="none" w:sz="0" w:space="0" w:color="000000"/>
+                <w:top w:val="none" w:sz="0" w:space="0" w:color="000000"/>
+                <w:left w:val="none" w:sz="0" w:space="0" w:color="000000"/>
+                <w:right w:val="none" w:sz="0" w:space="0" w:color="000000"/>
+              </w:pBdr>
+              <w:spacing w:after="100" w:before="100" w:line="240"/>
+              <w:ind w:left="100" w:right="100" w:firstLine="0" w:firstLineChars="0"/>
+              <w:rPr>
+                <w:rFonts w:ascii="Times New Roman" w:hAnsi="Times New Roman" w:eastAsia="Times New Roman" w:cs="Times New Roman"/>
+                <w:i w:val="false"/>
+                <w:b w:val="false"/>
+                <w:u w:val="none"/>
+                <w:strike w:val="false"/>
+                <w:sz w:val="18"/>
+                <w:szCs w:val="18"/>
+                <w:color w:val="000000"/>
+              </w:rPr>
+            </w:pPr>
+            <w:r>
+              <w:rPr>
+                <w:rFonts w:ascii="Times New Roman" w:hAnsi="Times New Roman" w:eastAsia="Times New Roman" w:cs="Times New Roman"/>
+                <w:i w:val="false"/>
+                <w:b w:val="false"/>
+                <w:u w:val="none"/>
+                <w:strike w:val="false"/>
+                <w:sz w:val="18"/>
+                <w:szCs w:val="18"/>
+                <w:color w:val="000000"/>
+              </w:rPr>
+              <w:t xml:space="preserve">0.75 (0.62–0.89)</w:t>
+            </w:r>
+          </w:p>
+        </w:tc>
+        <w:tc>
+          <w:tcPr>
+            <w:tcBorders>
+              <w:bottom w:val="none" w:sz="0" w:space="0" w:color="000000"/>
+              <w:top w:val="none" w:sz="0" w:space="0" w:color="000000"/>
+              <w:left w:val="none" w:sz="0" w:space="0" w:color="000000"/>
+              <w:right w:val="none" w:sz="0" w:space="0" w:color="000000"/>
+            </w:tcBorders>
+            <w:shd w:val="clear" w:color="auto" w:fill="FFFFFF"/>
+            <w:tcMar>
+              <w:top w:w="0" w:type="dxa"/>
+              <w:bottom w:w="0" w:type="dxa"/>
+              <w:left w:w="0" w:type="dxa"/>
+              <w:right w:w="0" w:type="dxa"/>
+            </w:tcMar>
+            <w:vAlign w:val="center"/>
+          </w:tcPr>
+          <w:p>
+            <w:pPr>
+              <w:pStyle w:val="Normal"/>
+              <w:jc w:val="left"/>
+              <w:pBdr>
+                <w:bottom w:val="none" w:sz="0" w:space="0" w:color="000000"/>
+                <w:top w:val="none" w:sz="0" w:space="0" w:color="000000"/>
+                <w:left w:val="none" w:sz="0" w:space="0" w:color="000000"/>
+                <w:right w:val="none" w:sz="0" w:space="0" w:color="000000"/>
+              </w:pBdr>
+              <w:spacing w:after="100" w:before="100" w:line="240"/>
+              <w:ind w:left="100" w:right="100" w:firstLine="0" w:firstLineChars="0"/>
+              <w:rPr>
+                <w:rFonts w:ascii="Times New Roman" w:hAnsi="Times New Roman" w:eastAsia="Times New Roman" w:cs="Times New Roman"/>
+                <w:i w:val="false"/>
+                <w:b w:val="false"/>
+                <w:u w:val="none"/>
+                <w:strike w:val="false"/>
+                <w:sz w:val="18"/>
+                <w:szCs w:val="18"/>
+                <w:color w:val="000000"/>
+              </w:rPr>
+            </w:pPr>
+            <w:r>
+              <w:rPr>
+                <w:rFonts w:ascii="Times New Roman" w:hAnsi="Times New Roman" w:eastAsia="Times New Roman" w:cs="Times New Roman"/>
+                <w:i w:val="false"/>
+                <w:b w:val="false"/>
+                <w:u w:val="none"/>
+                <w:strike w:val="false"/>
+                <w:sz w:val="18"/>
+                <w:szCs w:val="18"/>
+                <w:color w:val="000000"/>
+              </w:rPr>
+              <w:t xml:space="preserve">0.001</w:t>
             </w:r>
           </w:p>
         </w:tc>
@@ -2490,7 +2490,7 @@
                 <w:szCs w:val="18"/>
                 <w:color w:val="000000"/>
               </w:rPr>
-              <w:t xml:space="preserve">221</w:t>
+              <w:t xml:space="preserve">187</w:t>
             </w:r>
           </w:p>
         </w:tc>
@@ -2545,7 +2545,7 @@
                 <w:szCs w:val="18"/>
                 <w:color w:val="000000"/>
               </w:rPr>
-              <w:t xml:space="preserve">77</w:t>
+              <w:t xml:space="preserve">56</w:t>
             </w:r>
           </w:p>
         </w:tc>
@@ -2935,7 +2935,7 @@
                 <w:szCs w:val="18"/>
                 <w:color w:val="000000"/>
               </w:rPr>
-              <w:t xml:space="preserve">331</w:t>
+              <w:t xml:space="preserve">305</w:t>
             </w:r>
           </w:p>
         </w:tc>
@@ -2990,117 +2990,117 @@
                 <w:szCs w:val="18"/>
                 <w:color w:val="000000"/>
               </w:rPr>
-              <w:t xml:space="preserve">100</w:t>
-            </w:r>
-          </w:p>
-        </w:tc>
-        <w:tc>
-          <w:tcPr>
-            <w:tcBorders>
-              <w:bottom w:val="none" w:sz="0" w:space="0" w:color="000000"/>
-              <w:top w:val="none" w:sz="0" w:space="0" w:color="000000"/>
-              <w:left w:val="none" w:sz="0" w:space="0" w:color="000000"/>
-              <w:right w:val="none" w:sz="0" w:space="0" w:color="000000"/>
-            </w:tcBorders>
-            <w:shd w:val="clear" w:color="auto" w:fill="FFFFFF"/>
-            <w:tcMar>
-              <w:top w:w="0" w:type="dxa"/>
-              <w:bottom w:w="0" w:type="dxa"/>
-              <w:left w:w="0" w:type="dxa"/>
-              <w:right w:w="0" w:type="dxa"/>
-            </w:tcMar>
-            <w:vAlign w:val="center"/>
-          </w:tcPr>
-          <w:p>
-            <w:pPr>
-              <w:pStyle w:val="Normal"/>
-              <w:jc w:val="left"/>
-              <w:pBdr>
-                <w:bottom w:val="none" w:sz="0" w:space="0" w:color="000000"/>
-                <w:top w:val="none" w:sz="0" w:space="0" w:color="000000"/>
-                <w:left w:val="none" w:sz="0" w:space="0" w:color="000000"/>
-                <w:right w:val="none" w:sz="0" w:space="0" w:color="000000"/>
-              </w:pBdr>
-              <w:spacing w:after="100" w:before="100" w:line="240"/>
-              <w:ind w:left="100" w:right="100" w:firstLine="0" w:firstLineChars="0"/>
-              <w:rPr>
-                <w:rFonts w:ascii="Times New Roman" w:hAnsi="Times New Roman" w:eastAsia="Times New Roman" w:cs="Times New Roman"/>
-                <w:i w:val="false"/>
-                <w:b w:val="false"/>
-                <w:u w:val="none"/>
-                <w:strike w:val="false"/>
-                <w:sz w:val="18"/>
-                <w:szCs w:val="18"/>
-                <w:color w:val="000000"/>
-              </w:rPr>
-            </w:pPr>
-            <w:r>
-              <w:rPr>
-                <w:rFonts w:ascii="Times New Roman" w:hAnsi="Times New Roman" w:eastAsia="Times New Roman" w:cs="Times New Roman"/>
-                <w:i w:val="false"/>
-                <w:b w:val="false"/>
-                <w:u w:val="none"/>
-                <w:strike w:val="false"/>
-                <w:sz w:val="18"/>
-                <w:szCs w:val="18"/>
-                <w:color w:val="000000"/>
-              </w:rPr>
-              <w:t xml:space="preserve">0.97 (0.72–1.31)</w:t>
-            </w:r>
-          </w:p>
-        </w:tc>
-        <w:tc>
-          <w:tcPr>
-            <w:tcBorders>
-              <w:bottom w:val="none" w:sz="0" w:space="0" w:color="000000"/>
-              <w:top w:val="none" w:sz="0" w:space="0" w:color="000000"/>
-              <w:left w:val="none" w:sz="0" w:space="0" w:color="000000"/>
-              <w:right w:val="none" w:sz="0" w:space="0" w:color="000000"/>
-            </w:tcBorders>
-            <w:shd w:val="clear" w:color="auto" w:fill="FFFFFF"/>
-            <w:tcMar>
-              <w:top w:w="0" w:type="dxa"/>
-              <w:bottom w:w="0" w:type="dxa"/>
-              <w:left w:w="0" w:type="dxa"/>
-              <w:right w:w="0" w:type="dxa"/>
-            </w:tcMar>
-            <w:vAlign w:val="center"/>
-          </w:tcPr>
-          <w:p>
-            <w:pPr>
-              <w:pStyle w:val="Normal"/>
-              <w:jc w:val="left"/>
-              <w:pBdr>
-                <w:bottom w:val="none" w:sz="0" w:space="0" w:color="000000"/>
-                <w:top w:val="none" w:sz="0" w:space="0" w:color="000000"/>
-                <w:left w:val="none" w:sz="0" w:space="0" w:color="000000"/>
-                <w:right w:val="none" w:sz="0" w:space="0" w:color="000000"/>
-              </w:pBdr>
-              <w:spacing w:after="100" w:before="100" w:line="240"/>
-              <w:ind w:left="100" w:right="100" w:firstLine="0" w:firstLineChars="0"/>
-              <w:rPr>
-                <w:rFonts w:ascii="Times New Roman" w:hAnsi="Times New Roman" w:eastAsia="Times New Roman" w:cs="Times New Roman"/>
-                <w:i w:val="false"/>
-                <w:b w:val="false"/>
-                <w:u w:val="none"/>
-                <w:strike w:val="false"/>
-                <w:sz w:val="18"/>
-                <w:szCs w:val="18"/>
-                <w:color w:val="000000"/>
-              </w:rPr>
-            </w:pPr>
-            <w:r>
-              <w:rPr>
-                <w:rFonts w:ascii="Times New Roman" w:hAnsi="Times New Roman" w:eastAsia="Times New Roman" w:cs="Times New Roman"/>
-                <w:i w:val="false"/>
-                <w:b w:val="false"/>
-                <w:u w:val="none"/>
-                <w:strike w:val="false"/>
-                <w:sz w:val="18"/>
-                <w:szCs w:val="18"/>
-                <w:color w:val="000000"/>
-              </w:rPr>
-              <w:t xml:space="preserve">0.844</w:t>
+              <w:t xml:space="preserve">84</w:t>
+            </w:r>
+          </w:p>
+        </w:tc>
+        <w:tc>
+          <w:tcPr>
+            <w:tcBorders>
+              <w:bottom w:val="none" w:sz="0" w:space="0" w:color="000000"/>
+              <w:top w:val="none" w:sz="0" w:space="0" w:color="000000"/>
+              <w:left w:val="none" w:sz="0" w:space="0" w:color="000000"/>
+              <w:right w:val="none" w:sz="0" w:space="0" w:color="000000"/>
+            </w:tcBorders>
+            <w:shd w:val="clear" w:color="auto" w:fill="FFFFFF"/>
+            <w:tcMar>
+              <w:top w:w="0" w:type="dxa"/>
+              <w:bottom w:w="0" w:type="dxa"/>
+              <w:left w:w="0" w:type="dxa"/>
+              <w:right w:w="0" w:type="dxa"/>
+            </w:tcMar>
+            <w:vAlign w:val="center"/>
+          </w:tcPr>
+          <w:p>
+            <w:pPr>
+              <w:pStyle w:val="Normal"/>
+              <w:jc w:val="left"/>
+              <w:pBdr>
+                <w:bottom w:val="none" w:sz="0" w:space="0" w:color="000000"/>
+                <w:top w:val="none" w:sz="0" w:space="0" w:color="000000"/>
+                <w:left w:val="none" w:sz="0" w:space="0" w:color="000000"/>
+                <w:right w:val="none" w:sz="0" w:space="0" w:color="000000"/>
+              </w:pBdr>
+              <w:spacing w:after="100" w:before="100" w:line="240"/>
+              <w:ind w:left="100" w:right="100" w:firstLine="0" w:firstLineChars="0"/>
+              <w:rPr>
+                <w:rFonts w:ascii="Times New Roman" w:hAnsi="Times New Roman" w:eastAsia="Times New Roman" w:cs="Times New Roman"/>
+                <w:i w:val="false"/>
+                <w:b w:val="false"/>
+                <w:u w:val="none"/>
+                <w:strike w:val="false"/>
+                <w:sz w:val="18"/>
+                <w:szCs w:val="18"/>
+                <w:color w:val="000000"/>
+              </w:rPr>
+            </w:pPr>
+            <w:r>
+              <w:rPr>
+                <w:rFonts w:ascii="Times New Roman" w:hAnsi="Times New Roman" w:eastAsia="Times New Roman" w:cs="Times New Roman"/>
+                <w:i w:val="false"/>
+                <w:b w:val="false"/>
+                <w:u w:val="none"/>
+                <w:strike w:val="false"/>
+                <w:sz w:val="18"/>
+                <w:szCs w:val="18"/>
+                <w:color w:val="000000"/>
+              </w:rPr>
+              <w:t xml:space="preserve">1.08 (0.77–1.52)</w:t>
+            </w:r>
+          </w:p>
+        </w:tc>
+        <w:tc>
+          <w:tcPr>
+            <w:tcBorders>
+              <w:bottom w:val="none" w:sz="0" w:space="0" w:color="000000"/>
+              <w:top w:val="none" w:sz="0" w:space="0" w:color="000000"/>
+              <w:left w:val="none" w:sz="0" w:space="0" w:color="000000"/>
+              <w:right w:val="none" w:sz="0" w:space="0" w:color="000000"/>
+            </w:tcBorders>
+            <w:shd w:val="clear" w:color="auto" w:fill="FFFFFF"/>
+            <w:tcMar>
+              <w:top w:w="0" w:type="dxa"/>
+              <w:bottom w:w="0" w:type="dxa"/>
+              <w:left w:w="0" w:type="dxa"/>
+              <w:right w:w="0" w:type="dxa"/>
+            </w:tcMar>
+            <w:vAlign w:val="center"/>
+          </w:tcPr>
+          <w:p>
+            <w:pPr>
+              <w:pStyle w:val="Normal"/>
+              <w:jc w:val="left"/>
+              <w:pBdr>
+                <w:bottom w:val="none" w:sz="0" w:space="0" w:color="000000"/>
+                <w:top w:val="none" w:sz="0" w:space="0" w:color="000000"/>
+                <w:left w:val="none" w:sz="0" w:space="0" w:color="000000"/>
+                <w:right w:val="none" w:sz="0" w:space="0" w:color="000000"/>
+              </w:pBdr>
+              <w:spacing w:after="100" w:before="100" w:line="240"/>
+              <w:ind w:left="100" w:right="100" w:firstLine="0" w:firstLineChars="0"/>
+              <w:rPr>
+                <w:rFonts w:ascii="Times New Roman" w:hAnsi="Times New Roman" w:eastAsia="Times New Roman" w:cs="Times New Roman"/>
+                <w:i w:val="false"/>
+                <w:b w:val="false"/>
+                <w:u w:val="none"/>
+                <w:strike w:val="false"/>
+                <w:sz w:val="18"/>
+                <w:szCs w:val="18"/>
+                <w:color w:val="000000"/>
+              </w:rPr>
+            </w:pPr>
+            <w:r>
+              <w:rPr>
+                <w:rFonts w:ascii="Times New Roman" w:hAnsi="Times New Roman" w:eastAsia="Times New Roman" w:cs="Times New Roman"/>
+                <w:i w:val="false"/>
+                <w:b w:val="false"/>
+                <w:u w:val="none"/>
+                <w:strike w:val="false"/>
+                <w:sz w:val="18"/>
+                <w:szCs w:val="18"/>
+                <w:color w:val="000000"/>
+              </w:rPr>
+              <w:t xml:space="preserve">0.652</w:t>
             </w:r>
           </w:p>
         </w:tc>
@@ -3380,7 +3380,7 @@
                 <w:szCs w:val="18"/>
                 <w:color w:val="000000"/>
               </w:rPr>
-              <w:t xml:space="preserve">303</w:t>
+              <w:t xml:space="preserve">272</w:t>
             </w:r>
           </w:p>
         </w:tc>
@@ -3435,7 +3435,7 @@
                 <w:szCs w:val="18"/>
                 <w:color w:val="000000"/>
               </w:rPr>
-              <w:t xml:space="preserve">106</w:t>
+              <w:t xml:space="preserve">87</w:t>
             </w:r>
           </w:p>
         </w:tc>
@@ -3825,7 +3825,7 @@
                 <w:szCs w:val="18"/>
                 <w:color w:val="000000"/>
               </w:rPr>
-              <w:t xml:space="preserve">249</w:t>
+              <w:t xml:space="preserve">220</w:t>
             </w:r>
           </w:p>
         </w:tc>
@@ -3880,117 +3880,117 @@
                 <w:szCs w:val="18"/>
                 <w:color w:val="000000"/>
               </w:rPr>
-              <w:t xml:space="preserve">71</w:t>
-            </w:r>
-          </w:p>
-        </w:tc>
-        <w:tc>
-          <w:tcPr>
-            <w:tcBorders>
-              <w:bottom w:val="none" w:sz="0" w:space="0" w:color="000000"/>
-              <w:top w:val="none" w:sz="0" w:space="0" w:color="000000"/>
-              <w:left w:val="none" w:sz="0" w:space="0" w:color="000000"/>
-              <w:right w:val="none" w:sz="0" w:space="0" w:color="000000"/>
-            </w:tcBorders>
-            <w:shd w:val="clear" w:color="auto" w:fill="FFFFFF"/>
-            <w:tcMar>
-              <w:top w:w="0" w:type="dxa"/>
-              <w:bottom w:w="0" w:type="dxa"/>
-              <w:left w:w="0" w:type="dxa"/>
-              <w:right w:w="0" w:type="dxa"/>
-            </w:tcMar>
-            <w:vAlign w:val="center"/>
-          </w:tcPr>
-          <w:p>
-            <w:pPr>
-              <w:pStyle w:val="Normal"/>
-              <w:jc w:val="left"/>
-              <w:pBdr>
-                <w:bottom w:val="none" w:sz="0" w:space="0" w:color="000000"/>
-                <w:top w:val="none" w:sz="0" w:space="0" w:color="000000"/>
-                <w:left w:val="none" w:sz="0" w:space="0" w:color="000000"/>
-                <w:right w:val="none" w:sz="0" w:space="0" w:color="000000"/>
-              </w:pBdr>
-              <w:spacing w:after="100" w:before="100" w:line="240"/>
-              <w:ind w:left="100" w:right="100" w:firstLine="0" w:firstLineChars="0"/>
-              <w:rPr>
-                <w:rFonts w:ascii="Times New Roman" w:hAnsi="Times New Roman" w:eastAsia="Times New Roman" w:cs="Times New Roman"/>
-                <w:i w:val="false"/>
-                <w:b w:val="false"/>
-                <w:u w:val="none"/>
-                <w:strike w:val="false"/>
-                <w:sz w:val="18"/>
-                <w:szCs w:val="18"/>
-                <w:color w:val="000000"/>
-              </w:rPr>
-            </w:pPr>
-            <w:r>
-              <w:rPr>
-                <w:rFonts w:ascii="Times New Roman" w:hAnsi="Times New Roman" w:eastAsia="Times New Roman" w:cs="Times New Roman"/>
-                <w:i w:val="false"/>
-                <w:b w:val="false"/>
-                <w:u w:val="none"/>
-                <w:strike w:val="false"/>
-                <w:sz w:val="18"/>
-                <w:szCs w:val="18"/>
-                <w:color w:val="000000"/>
-              </w:rPr>
-              <w:t xml:space="preserve">0.73 (0.54–0.99)</w:t>
-            </w:r>
-          </w:p>
-        </w:tc>
-        <w:tc>
-          <w:tcPr>
-            <w:tcBorders>
-              <w:bottom w:val="none" w:sz="0" w:space="0" w:color="000000"/>
-              <w:top w:val="none" w:sz="0" w:space="0" w:color="000000"/>
-              <w:left w:val="none" w:sz="0" w:space="0" w:color="000000"/>
-              <w:right w:val="none" w:sz="0" w:space="0" w:color="000000"/>
-            </w:tcBorders>
-            <w:shd w:val="clear" w:color="auto" w:fill="FFFFFF"/>
-            <w:tcMar>
-              <w:top w:w="0" w:type="dxa"/>
-              <w:bottom w:w="0" w:type="dxa"/>
-              <w:left w:w="0" w:type="dxa"/>
-              <w:right w:w="0" w:type="dxa"/>
-            </w:tcMar>
-            <w:vAlign w:val="center"/>
-          </w:tcPr>
-          <w:p>
-            <w:pPr>
-              <w:pStyle w:val="Normal"/>
-              <w:jc w:val="left"/>
-              <w:pBdr>
-                <w:bottom w:val="none" w:sz="0" w:space="0" w:color="000000"/>
-                <w:top w:val="none" w:sz="0" w:space="0" w:color="000000"/>
-                <w:left w:val="none" w:sz="0" w:space="0" w:color="000000"/>
-                <w:right w:val="none" w:sz="0" w:space="0" w:color="000000"/>
-              </w:pBdr>
-              <w:spacing w:after="100" w:before="100" w:line="240"/>
-              <w:ind w:left="100" w:right="100" w:firstLine="0" w:firstLineChars="0"/>
-              <w:rPr>
-                <w:rFonts w:ascii="Times New Roman" w:hAnsi="Times New Roman" w:eastAsia="Times New Roman" w:cs="Times New Roman"/>
-                <w:i w:val="false"/>
-                <w:b w:val="false"/>
-                <w:u w:val="none"/>
-                <w:strike w:val="false"/>
-                <w:sz w:val="18"/>
-                <w:szCs w:val="18"/>
-                <w:color w:val="000000"/>
-              </w:rPr>
-            </w:pPr>
-            <w:r>
-              <w:rPr>
-                <w:rFonts w:ascii="Times New Roman" w:hAnsi="Times New Roman" w:eastAsia="Times New Roman" w:cs="Times New Roman"/>
-                <w:i w:val="false"/>
-                <w:b w:val="false"/>
-                <w:u w:val="none"/>
-                <w:strike w:val="false"/>
-                <w:sz w:val="18"/>
-                <w:szCs w:val="18"/>
-                <w:color w:val="000000"/>
-              </w:rPr>
-              <w:t xml:space="preserve">0.045</w:t>
+              <w:t xml:space="preserve">53</w:t>
+            </w:r>
+          </w:p>
+        </w:tc>
+        <w:tc>
+          <w:tcPr>
+            <w:tcBorders>
+              <w:bottom w:val="none" w:sz="0" w:space="0" w:color="000000"/>
+              <w:top w:val="none" w:sz="0" w:space="0" w:color="000000"/>
+              <w:left w:val="none" w:sz="0" w:space="0" w:color="000000"/>
+              <w:right w:val="none" w:sz="0" w:space="0" w:color="000000"/>
+            </w:tcBorders>
+            <w:shd w:val="clear" w:color="auto" w:fill="FFFFFF"/>
+            <w:tcMar>
+              <w:top w:w="0" w:type="dxa"/>
+              <w:bottom w:w="0" w:type="dxa"/>
+              <w:left w:w="0" w:type="dxa"/>
+              <w:right w:w="0" w:type="dxa"/>
+            </w:tcMar>
+            <w:vAlign w:val="center"/>
+          </w:tcPr>
+          <w:p>
+            <w:pPr>
+              <w:pStyle w:val="Normal"/>
+              <w:jc w:val="left"/>
+              <w:pBdr>
+                <w:bottom w:val="none" w:sz="0" w:space="0" w:color="000000"/>
+                <w:top w:val="none" w:sz="0" w:space="0" w:color="000000"/>
+                <w:left w:val="none" w:sz="0" w:space="0" w:color="000000"/>
+                <w:right w:val="none" w:sz="0" w:space="0" w:color="000000"/>
+              </w:pBdr>
+              <w:spacing w:after="100" w:before="100" w:line="240"/>
+              <w:ind w:left="100" w:right="100" w:firstLine="0" w:firstLineChars="0"/>
+              <w:rPr>
+                <w:rFonts w:ascii="Times New Roman" w:hAnsi="Times New Roman" w:eastAsia="Times New Roman" w:cs="Times New Roman"/>
+                <w:i w:val="false"/>
+                <w:b w:val="false"/>
+                <w:u w:val="none"/>
+                <w:strike w:val="false"/>
+                <w:sz w:val="18"/>
+                <w:szCs w:val="18"/>
+                <w:color w:val="000000"/>
+              </w:rPr>
+            </w:pPr>
+            <w:r>
+              <w:rPr>
+                <w:rFonts w:ascii="Times New Roman" w:hAnsi="Times New Roman" w:eastAsia="Times New Roman" w:cs="Times New Roman"/>
+                <w:i w:val="false"/>
+                <w:b w:val="false"/>
+                <w:u w:val="none"/>
+                <w:strike w:val="false"/>
+                <w:sz w:val="18"/>
+                <w:szCs w:val="18"/>
+                <w:color w:val="000000"/>
+              </w:rPr>
+              <w:t xml:space="preserve">0.70 (0.50–0.99)</w:t>
+            </w:r>
+          </w:p>
+        </w:tc>
+        <w:tc>
+          <w:tcPr>
+            <w:tcBorders>
+              <w:bottom w:val="none" w:sz="0" w:space="0" w:color="000000"/>
+              <w:top w:val="none" w:sz="0" w:space="0" w:color="000000"/>
+              <w:left w:val="none" w:sz="0" w:space="0" w:color="000000"/>
+              <w:right w:val="none" w:sz="0" w:space="0" w:color="000000"/>
+            </w:tcBorders>
+            <w:shd w:val="clear" w:color="auto" w:fill="FFFFFF"/>
+            <w:tcMar>
+              <w:top w:w="0" w:type="dxa"/>
+              <w:bottom w:w="0" w:type="dxa"/>
+              <w:left w:w="0" w:type="dxa"/>
+              <w:right w:w="0" w:type="dxa"/>
+            </w:tcMar>
+            <w:vAlign w:val="center"/>
+          </w:tcPr>
+          <w:p>
+            <w:pPr>
+              <w:pStyle w:val="Normal"/>
+              <w:jc w:val="left"/>
+              <w:pBdr>
+                <w:bottom w:val="none" w:sz="0" w:space="0" w:color="000000"/>
+                <w:top w:val="none" w:sz="0" w:space="0" w:color="000000"/>
+                <w:left w:val="none" w:sz="0" w:space="0" w:color="000000"/>
+                <w:right w:val="none" w:sz="0" w:space="0" w:color="000000"/>
+              </w:pBdr>
+              <w:spacing w:after="100" w:before="100" w:line="240"/>
+              <w:ind w:left="100" w:right="100" w:firstLine="0" w:firstLineChars="0"/>
+              <w:rPr>
+                <w:rFonts w:ascii="Times New Roman" w:hAnsi="Times New Roman" w:eastAsia="Times New Roman" w:cs="Times New Roman"/>
+                <w:i w:val="false"/>
+                <w:b w:val="false"/>
+                <w:u w:val="none"/>
+                <w:strike w:val="false"/>
+                <w:sz w:val="18"/>
+                <w:szCs w:val="18"/>
+                <w:color w:val="000000"/>
+              </w:rPr>
+            </w:pPr>
+            <w:r>
+              <w:rPr>
+                <w:rFonts w:ascii="Times New Roman" w:hAnsi="Times New Roman" w:eastAsia="Times New Roman" w:cs="Times New Roman"/>
+                <w:i w:val="false"/>
+                <w:b w:val="false"/>
+                <w:u w:val="none"/>
+                <w:strike w:val="false"/>
+                <w:sz w:val="18"/>
+                <w:szCs w:val="18"/>
+                <w:color w:val="000000"/>
+              </w:rPr>
+              <w:t xml:space="preserve">0.041</w:t>
             </w:r>
           </w:p>
         </w:tc>
@@ -4715,7 +4715,7 @@
                 <w:szCs w:val="18"/>
                 <w:color w:val="000000"/>
               </w:rPr>
-              <w:t xml:space="preserve">261</w:t>
+              <w:t xml:space="preserve">201</w:t>
             </w:r>
           </w:p>
         </w:tc>
@@ -4770,62 +4770,62 @@
                 <w:szCs w:val="18"/>
                 <w:color w:val="000000"/>
               </w:rPr>
-              <w:t xml:space="preserve">117</w:t>
-            </w:r>
-          </w:p>
-        </w:tc>
-        <w:tc>
-          <w:tcPr>
-            <w:tcBorders>
-              <w:bottom w:val="none" w:sz="0" w:space="0" w:color="000000"/>
-              <w:top w:val="none" w:sz="0" w:space="0" w:color="000000"/>
-              <w:left w:val="none" w:sz="0" w:space="0" w:color="000000"/>
-              <w:right w:val="none" w:sz="0" w:space="0" w:color="000000"/>
-            </w:tcBorders>
-            <w:shd w:val="clear" w:color="auto" w:fill="FFFFFF"/>
-            <w:tcMar>
-              <w:top w:w="0" w:type="dxa"/>
-              <w:bottom w:w="0" w:type="dxa"/>
-              <w:left w:w="0" w:type="dxa"/>
-              <w:right w:w="0" w:type="dxa"/>
-            </w:tcMar>
-            <w:vAlign w:val="center"/>
-          </w:tcPr>
-          <w:p>
-            <w:pPr>
-              <w:pStyle w:val="Normal"/>
-              <w:jc w:val="left"/>
-              <w:pBdr>
-                <w:bottom w:val="none" w:sz="0" w:space="0" w:color="000000"/>
-                <w:top w:val="none" w:sz="0" w:space="0" w:color="000000"/>
-                <w:left w:val="none" w:sz="0" w:space="0" w:color="000000"/>
-                <w:right w:val="none" w:sz="0" w:space="0" w:color="000000"/>
-              </w:pBdr>
-              <w:spacing w:after="100" w:before="100" w:line="240"/>
-              <w:ind w:left="100" w:right="100" w:firstLine="0" w:firstLineChars="0"/>
-              <w:rPr>
-                <w:rFonts w:ascii="Times New Roman" w:hAnsi="Times New Roman" w:eastAsia="Times New Roman" w:cs="Times New Roman"/>
-                <w:i w:val="false"/>
-                <w:b w:val="false"/>
-                <w:u w:val="none"/>
-                <w:strike w:val="false"/>
-                <w:sz w:val="18"/>
-                <w:szCs w:val="18"/>
-                <w:color w:val="000000"/>
-              </w:rPr>
-            </w:pPr>
-            <w:r>
-              <w:rPr>
-                <w:rFonts w:ascii="Times New Roman" w:hAnsi="Times New Roman" w:eastAsia="Times New Roman" w:cs="Times New Roman"/>
-                <w:i w:val="false"/>
-                <w:b w:val="false"/>
-                <w:u w:val="none"/>
-                <w:strike w:val="false"/>
-                <w:sz w:val="18"/>
-                <w:szCs w:val="18"/>
-                <w:color w:val="000000"/>
-              </w:rPr>
-              <w:t xml:space="preserve">2.69 (1.97–3.69)</w:t>
+              <w:t xml:space="preserve">80</w:t>
+            </w:r>
+          </w:p>
+        </w:tc>
+        <w:tc>
+          <w:tcPr>
+            <w:tcBorders>
+              <w:bottom w:val="none" w:sz="0" w:space="0" w:color="000000"/>
+              <w:top w:val="none" w:sz="0" w:space="0" w:color="000000"/>
+              <w:left w:val="none" w:sz="0" w:space="0" w:color="000000"/>
+              <w:right w:val="none" w:sz="0" w:space="0" w:color="000000"/>
+            </w:tcBorders>
+            <w:shd w:val="clear" w:color="auto" w:fill="FFFFFF"/>
+            <w:tcMar>
+              <w:top w:w="0" w:type="dxa"/>
+              <w:bottom w:w="0" w:type="dxa"/>
+              <w:left w:w="0" w:type="dxa"/>
+              <w:right w:w="0" w:type="dxa"/>
+            </w:tcMar>
+            <w:vAlign w:val="center"/>
+          </w:tcPr>
+          <w:p>
+            <w:pPr>
+              <w:pStyle w:val="Normal"/>
+              <w:jc w:val="left"/>
+              <w:pBdr>
+                <w:bottom w:val="none" w:sz="0" w:space="0" w:color="000000"/>
+                <w:top w:val="none" w:sz="0" w:space="0" w:color="000000"/>
+                <w:left w:val="none" w:sz="0" w:space="0" w:color="000000"/>
+                <w:right w:val="none" w:sz="0" w:space="0" w:color="000000"/>
+              </w:pBdr>
+              <w:spacing w:after="100" w:before="100" w:line="240"/>
+              <w:ind w:left="100" w:right="100" w:firstLine="0" w:firstLineChars="0"/>
+              <w:rPr>
+                <w:rFonts w:ascii="Times New Roman" w:hAnsi="Times New Roman" w:eastAsia="Times New Roman" w:cs="Times New Roman"/>
+                <w:i w:val="false"/>
+                <w:b w:val="false"/>
+                <w:u w:val="none"/>
+                <w:strike w:val="false"/>
+                <w:sz w:val="18"/>
+                <w:szCs w:val="18"/>
+                <w:color w:val="000000"/>
+              </w:rPr>
+            </w:pPr>
+            <w:r>
+              <w:rPr>
+                <w:rFonts w:ascii="Times New Roman" w:hAnsi="Times New Roman" w:eastAsia="Times New Roman" w:cs="Times New Roman"/>
+                <w:i w:val="false"/>
+                <w:b w:val="false"/>
+                <w:u w:val="none"/>
+                <w:strike w:val="false"/>
+                <w:sz w:val="18"/>
+                <w:szCs w:val="18"/>
+                <w:color w:val="000000"/>
+              </w:rPr>
+              <w:t xml:space="preserve">2.11 (1.51–2.96)</w:t>
             </w:r>
           </w:p>
         </w:tc>
@@ -5160,7 +5160,7 @@
                 <w:szCs w:val="18"/>
                 <w:color w:val="000000"/>
               </w:rPr>
-              <w:t xml:space="preserve">506</w:t>
+              <w:t xml:space="preserve">448</w:t>
             </w:r>
           </w:p>
         </w:tc>
@@ -5215,117 +5215,117 @@
                 <w:szCs w:val="18"/>
                 <w:color w:val="000000"/>
               </w:rPr>
-              <w:t xml:space="preserve">167</w:t>
-            </w:r>
-          </w:p>
-        </w:tc>
-        <w:tc>
-          <w:tcPr>
-            <w:tcBorders>
-              <w:bottom w:val="none" w:sz="0" w:space="0" w:color="000000"/>
-              <w:top w:val="none" w:sz="0" w:space="0" w:color="000000"/>
-              <w:left w:val="none" w:sz="0" w:space="0" w:color="000000"/>
-              <w:right w:val="none" w:sz="0" w:space="0" w:color="000000"/>
-            </w:tcBorders>
-            <w:shd w:val="clear" w:color="auto" w:fill="FFFFFF"/>
-            <w:tcMar>
-              <w:top w:w="0" w:type="dxa"/>
-              <w:bottom w:w="0" w:type="dxa"/>
-              <w:left w:w="0" w:type="dxa"/>
-              <w:right w:w="0" w:type="dxa"/>
-            </w:tcMar>
-            <w:vAlign w:val="center"/>
-          </w:tcPr>
-          <w:p>
-            <w:pPr>
-              <w:pStyle w:val="Normal"/>
-              <w:jc w:val="left"/>
-              <w:pBdr>
-                <w:bottom w:val="none" w:sz="0" w:space="0" w:color="000000"/>
-                <w:top w:val="none" w:sz="0" w:space="0" w:color="000000"/>
-                <w:left w:val="none" w:sz="0" w:space="0" w:color="000000"/>
-                <w:right w:val="none" w:sz="0" w:space="0" w:color="000000"/>
-              </w:pBdr>
-              <w:spacing w:after="100" w:before="100" w:line="240"/>
-              <w:ind w:left="100" w:right="100" w:firstLine="0" w:firstLineChars="0"/>
-              <w:rPr>
-                <w:rFonts w:ascii="Times New Roman" w:hAnsi="Times New Roman" w:eastAsia="Times New Roman" w:cs="Times New Roman"/>
-                <w:i w:val="false"/>
-                <w:b w:val="false"/>
-                <w:u w:val="none"/>
-                <w:strike w:val="false"/>
-                <w:sz w:val="18"/>
-                <w:szCs w:val="18"/>
-                <w:color w:val="000000"/>
-              </w:rPr>
-            </w:pPr>
-            <w:r>
-              <w:rPr>
-                <w:rFonts w:ascii="Times New Roman" w:hAnsi="Times New Roman" w:eastAsia="Times New Roman" w:cs="Times New Roman"/>
-                <w:i w:val="false"/>
-                <w:b w:val="false"/>
-                <w:u w:val="none"/>
-                <w:strike w:val="false"/>
-                <w:sz w:val="18"/>
-                <w:szCs w:val="18"/>
-                <w:color w:val="000000"/>
-              </w:rPr>
-              <w:t xml:space="preserve">0.81 (0.69–0.96)</w:t>
-            </w:r>
-          </w:p>
-        </w:tc>
-        <w:tc>
-          <w:tcPr>
-            <w:tcBorders>
-              <w:bottom w:val="none" w:sz="0" w:space="0" w:color="000000"/>
-              <w:top w:val="none" w:sz="0" w:space="0" w:color="000000"/>
-              <w:left w:val="none" w:sz="0" w:space="0" w:color="000000"/>
-              <w:right w:val="none" w:sz="0" w:space="0" w:color="000000"/>
-            </w:tcBorders>
-            <w:shd w:val="clear" w:color="auto" w:fill="FFFFFF"/>
-            <w:tcMar>
-              <w:top w:w="0" w:type="dxa"/>
-              <w:bottom w:w="0" w:type="dxa"/>
-              <w:left w:w="0" w:type="dxa"/>
-              <w:right w:w="0" w:type="dxa"/>
-            </w:tcMar>
-            <w:vAlign w:val="center"/>
-          </w:tcPr>
-          <w:p>
-            <w:pPr>
-              <w:pStyle w:val="Normal"/>
-              <w:jc w:val="left"/>
-              <w:pBdr>
-                <w:bottom w:val="none" w:sz="0" w:space="0" w:color="000000"/>
-                <w:top w:val="none" w:sz="0" w:space="0" w:color="000000"/>
-                <w:left w:val="none" w:sz="0" w:space="0" w:color="000000"/>
-                <w:right w:val="none" w:sz="0" w:space="0" w:color="000000"/>
-              </w:pBdr>
-              <w:spacing w:after="100" w:before="100" w:line="240"/>
-              <w:ind w:left="100" w:right="100" w:firstLine="0" w:firstLineChars="0"/>
-              <w:rPr>
-                <w:rFonts w:ascii="Times New Roman" w:hAnsi="Times New Roman" w:eastAsia="Times New Roman" w:cs="Times New Roman"/>
-                <w:i w:val="false"/>
-                <w:b w:val="false"/>
-                <w:u w:val="none"/>
-                <w:strike w:val="false"/>
-                <w:sz w:val="18"/>
-                <w:szCs w:val="18"/>
-                <w:color w:val="000000"/>
-              </w:rPr>
-            </w:pPr>
-            <w:r>
-              <w:rPr>
-                <w:rFonts w:ascii="Times New Roman" w:hAnsi="Times New Roman" w:eastAsia="Times New Roman" w:cs="Times New Roman"/>
-                <w:i w:val="false"/>
-                <w:b w:val="false"/>
-                <w:u w:val="none"/>
-                <w:strike w:val="false"/>
-                <w:sz w:val="18"/>
-                <w:szCs w:val="18"/>
-                <w:color w:val="000000"/>
-              </w:rPr>
-              <w:t xml:space="preserve">0.013</w:t>
+              <w:t xml:space="preserve">132</w:t>
+            </w:r>
+          </w:p>
+        </w:tc>
+        <w:tc>
+          <w:tcPr>
+            <w:tcBorders>
+              <w:bottom w:val="none" w:sz="0" w:space="0" w:color="000000"/>
+              <w:top w:val="none" w:sz="0" w:space="0" w:color="000000"/>
+              <w:left w:val="none" w:sz="0" w:space="0" w:color="000000"/>
+              <w:right w:val="none" w:sz="0" w:space="0" w:color="000000"/>
+            </w:tcBorders>
+            <w:shd w:val="clear" w:color="auto" w:fill="FFFFFF"/>
+            <w:tcMar>
+              <w:top w:w="0" w:type="dxa"/>
+              <w:bottom w:w="0" w:type="dxa"/>
+              <w:left w:w="0" w:type="dxa"/>
+              <w:right w:w="0" w:type="dxa"/>
+            </w:tcMar>
+            <w:vAlign w:val="center"/>
+          </w:tcPr>
+          <w:p>
+            <w:pPr>
+              <w:pStyle w:val="Normal"/>
+              <w:jc w:val="left"/>
+              <w:pBdr>
+                <w:bottom w:val="none" w:sz="0" w:space="0" w:color="000000"/>
+                <w:top w:val="none" w:sz="0" w:space="0" w:color="000000"/>
+                <w:left w:val="none" w:sz="0" w:space="0" w:color="000000"/>
+                <w:right w:val="none" w:sz="0" w:space="0" w:color="000000"/>
+              </w:pBdr>
+              <w:spacing w:after="100" w:before="100" w:line="240"/>
+              <w:ind w:left="100" w:right="100" w:firstLine="0" w:firstLineChars="0"/>
+              <w:rPr>
+                <w:rFonts w:ascii="Times New Roman" w:hAnsi="Times New Roman" w:eastAsia="Times New Roman" w:cs="Times New Roman"/>
+                <w:i w:val="false"/>
+                <w:b w:val="false"/>
+                <w:u w:val="none"/>
+                <w:strike w:val="false"/>
+                <w:sz w:val="18"/>
+                <w:szCs w:val="18"/>
+                <w:color w:val="000000"/>
+              </w:rPr>
+            </w:pPr>
+            <w:r>
+              <w:rPr>
+                <w:rFonts w:ascii="Times New Roman" w:hAnsi="Times New Roman" w:eastAsia="Times New Roman" w:cs="Times New Roman"/>
+                <w:i w:val="false"/>
+                <w:b w:val="false"/>
+                <w:u w:val="none"/>
+                <w:strike w:val="false"/>
+                <w:sz w:val="18"/>
+                <w:szCs w:val="18"/>
+                <w:color w:val="000000"/>
+              </w:rPr>
+              <w:t xml:space="preserve">0.76 (0.63–0.92)</w:t>
+            </w:r>
+          </w:p>
+        </w:tc>
+        <w:tc>
+          <w:tcPr>
+            <w:tcBorders>
+              <w:bottom w:val="none" w:sz="0" w:space="0" w:color="000000"/>
+              <w:top w:val="none" w:sz="0" w:space="0" w:color="000000"/>
+              <w:left w:val="none" w:sz="0" w:space="0" w:color="000000"/>
+              <w:right w:val="none" w:sz="0" w:space="0" w:color="000000"/>
+            </w:tcBorders>
+            <w:shd w:val="clear" w:color="auto" w:fill="FFFFFF"/>
+            <w:tcMar>
+              <w:top w:w="0" w:type="dxa"/>
+              <w:bottom w:w="0" w:type="dxa"/>
+              <w:left w:w="0" w:type="dxa"/>
+              <w:right w:w="0" w:type="dxa"/>
+            </w:tcMar>
+            <w:vAlign w:val="center"/>
+          </w:tcPr>
+          <w:p>
+            <w:pPr>
+              <w:pStyle w:val="Normal"/>
+              <w:jc w:val="left"/>
+              <w:pBdr>
+                <w:bottom w:val="none" w:sz="0" w:space="0" w:color="000000"/>
+                <w:top w:val="none" w:sz="0" w:space="0" w:color="000000"/>
+                <w:left w:val="none" w:sz="0" w:space="0" w:color="000000"/>
+                <w:right w:val="none" w:sz="0" w:space="0" w:color="000000"/>
+              </w:pBdr>
+              <w:spacing w:after="100" w:before="100" w:line="240"/>
+              <w:ind w:left="100" w:right="100" w:firstLine="0" w:firstLineChars="0"/>
+              <w:rPr>
+                <w:rFonts w:ascii="Times New Roman" w:hAnsi="Times New Roman" w:eastAsia="Times New Roman" w:cs="Times New Roman"/>
+                <w:i w:val="false"/>
+                <w:b w:val="false"/>
+                <w:u w:val="none"/>
+                <w:strike w:val="false"/>
+                <w:sz w:val="18"/>
+                <w:szCs w:val="18"/>
+                <w:color w:val="000000"/>
+              </w:rPr>
+            </w:pPr>
+            <w:r>
+              <w:rPr>
+                <w:rFonts w:ascii="Times New Roman" w:hAnsi="Times New Roman" w:eastAsia="Times New Roman" w:cs="Times New Roman"/>
+                <w:i w:val="false"/>
+                <w:b w:val="false"/>
+                <w:u w:val="none"/>
+                <w:strike w:val="false"/>
+                <w:sz w:val="18"/>
+                <w:szCs w:val="18"/>
+                <w:color w:val="000000"/>
+              </w:rPr>
+              <w:t xml:space="preserve">0.004</w:t>
             </w:r>
           </w:p>
         </w:tc>
@@ -5605,7 +5605,7 @@
                 <w:szCs w:val="18"/>
                 <w:color w:val="000000"/>
               </w:rPr>
-              <w:t xml:space="preserve">204</w:t>
+              <w:t xml:space="preserve">171</w:t>
             </w:r>
           </w:p>
         </w:tc>
@@ -5660,7 +5660,7 @@
                 <w:szCs w:val="18"/>
                 <w:color w:val="000000"/>
               </w:rPr>
-              <w:t xml:space="preserve">72</w:t>
+              <w:t xml:space="preserve">52</w:t>
             </w:r>
           </w:p>
         </w:tc>
@@ -6050,7 +6050,7 @@
                 <w:szCs w:val="18"/>
                 <w:color w:val="000000"/>
               </w:rPr>
-              <w:t xml:space="preserve">302</w:t>
+              <w:t xml:space="preserve">277</w:t>
             </w:r>
           </w:p>
         </w:tc>
@@ -6105,117 +6105,117 @@
                 <w:szCs w:val="18"/>
                 <w:color w:val="000000"/>
               </w:rPr>
-              <w:t xml:space="preserve">95</w:t>
-            </w:r>
-          </w:p>
-        </w:tc>
-        <w:tc>
-          <w:tcPr>
-            <w:tcBorders>
-              <w:bottom w:val="none" w:sz="0" w:space="0" w:color="000000"/>
-              <w:top w:val="none" w:sz="0" w:space="0" w:color="000000"/>
-              <w:left w:val="none" w:sz="0" w:space="0" w:color="000000"/>
-              <w:right w:val="none" w:sz="0" w:space="0" w:color="000000"/>
-            </w:tcBorders>
-            <w:shd w:val="clear" w:color="auto" w:fill="FFFFFF"/>
-            <w:tcMar>
-              <w:top w:w="0" w:type="dxa"/>
-              <w:bottom w:w="0" w:type="dxa"/>
-              <w:left w:w="0" w:type="dxa"/>
-              <w:right w:w="0" w:type="dxa"/>
-            </w:tcMar>
-            <w:vAlign w:val="center"/>
-          </w:tcPr>
-          <w:p>
-            <w:pPr>
-              <w:pStyle w:val="Normal"/>
-              <w:jc w:val="left"/>
-              <w:pBdr>
-                <w:bottom w:val="none" w:sz="0" w:space="0" w:color="000000"/>
-                <w:top w:val="none" w:sz="0" w:space="0" w:color="000000"/>
-                <w:left w:val="none" w:sz="0" w:space="0" w:color="000000"/>
-                <w:right w:val="none" w:sz="0" w:space="0" w:color="000000"/>
-              </w:pBdr>
-              <w:spacing w:after="100" w:before="100" w:line="240"/>
-              <w:ind w:left="100" w:right="100" w:firstLine="0" w:firstLineChars="0"/>
-              <w:rPr>
-                <w:rFonts w:ascii="Times New Roman" w:hAnsi="Times New Roman" w:eastAsia="Times New Roman" w:cs="Times New Roman"/>
-                <w:i w:val="false"/>
-                <w:b w:val="false"/>
-                <w:u w:val="none"/>
-                <w:strike w:val="false"/>
-                <w:sz w:val="18"/>
-                <w:szCs w:val="18"/>
-                <w:color w:val="000000"/>
-              </w:rPr>
-            </w:pPr>
-            <w:r>
-              <w:rPr>
-                <w:rFonts w:ascii="Times New Roman" w:hAnsi="Times New Roman" w:eastAsia="Times New Roman" w:cs="Times New Roman"/>
-                <w:i w:val="false"/>
-                <w:b w:val="false"/>
-                <w:u w:val="none"/>
-                <w:strike w:val="false"/>
-                <w:sz w:val="18"/>
-                <w:szCs w:val="18"/>
-                <w:color w:val="000000"/>
-              </w:rPr>
-              <w:t xml:space="preserve">0.98 (0.72–1.33)</w:t>
-            </w:r>
-          </w:p>
-        </w:tc>
-        <w:tc>
-          <w:tcPr>
-            <w:tcBorders>
-              <w:bottom w:val="none" w:sz="0" w:space="0" w:color="000000"/>
-              <w:top w:val="none" w:sz="0" w:space="0" w:color="000000"/>
-              <w:left w:val="none" w:sz="0" w:space="0" w:color="000000"/>
-              <w:right w:val="none" w:sz="0" w:space="0" w:color="000000"/>
-            </w:tcBorders>
-            <w:shd w:val="clear" w:color="auto" w:fill="FFFFFF"/>
-            <w:tcMar>
-              <w:top w:w="0" w:type="dxa"/>
-              <w:bottom w:w="0" w:type="dxa"/>
-              <w:left w:w="0" w:type="dxa"/>
-              <w:right w:w="0" w:type="dxa"/>
-            </w:tcMar>
-            <w:vAlign w:val="center"/>
-          </w:tcPr>
-          <w:p>
-            <w:pPr>
-              <w:pStyle w:val="Normal"/>
-              <w:jc w:val="left"/>
-              <w:pBdr>
-                <w:bottom w:val="none" w:sz="0" w:space="0" w:color="000000"/>
-                <w:top w:val="none" w:sz="0" w:space="0" w:color="000000"/>
-                <w:left w:val="none" w:sz="0" w:space="0" w:color="000000"/>
-                <w:right w:val="none" w:sz="0" w:space="0" w:color="000000"/>
-              </w:pBdr>
-              <w:spacing w:after="100" w:before="100" w:line="240"/>
-              <w:ind w:left="100" w:right="100" w:firstLine="0" w:firstLineChars="0"/>
-              <w:rPr>
-                <w:rFonts w:ascii="Times New Roman" w:hAnsi="Times New Roman" w:eastAsia="Times New Roman" w:cs="Times New Roman"/>
-                <w:i w:val="false"/>
-                <w:b w:val="false"/>
-                <w:u w:val="none"/>
-                <w:strike w:val="false"/>
-                <w:sz w:val="18"/>
-                <w:szCs w:val="18"/>
-                <w:color w:val="000000"/>
-              </w:rPr>
-            </w:pPr>
-            <w:r>
-              <w:rPr>
-                <w:rFonts w:ascii="Times New Roman" w:hAnsi="Times New Roman" w:eastAsia="Times New Roman" w:cs="Times New Roman"/>
-                <w:i w:val="false"/>
-                <w:b w:val="false"/>
-                <w:u w:val="none"/>
-                <w:strike w:val="false"/>
-                <w:sz w:val="18"/>
-                <w:szCs w:val="18"/>
-                <w:color w:val="000000"/>
-              </w:rPr>
-              <w:t xml:space="preserve">0.894</w:t>
+              <w:t xml:space="preserve">80</w:t>
+            </w:r>
+          </w:p>
+        </w:tc>
+        <w:tc>
+          <w:tcPr>
+            <w:tcBorders>
+              <w:bottom w:val="none" w:sz="0" w:space="0" w:color="000000"/>
+              <w:top w:val="none" w:sz="0" w:space="0" w:color="000000"/>
+              <w:left w:val="none" w:sz="0" w:space="0" w:color="000000"/>
+              <w:right w:val="none" w:sz="0" w:space="0" w:color="000000"/>
+            </w:tcBorders>
+            <w:shd w:val="clear" w:color="auto" w:fill="FFFFFF"/>
+            <w:tcMar>
+              <w:top w:w="0" w:type="dxa"/>
+              <w:bottom w:w="0" w:type="dxa"/>
+              <w:left w:w="0" w:type="dxa"/>
+              <w:right w:w="0" w:type="dxa"/>
+            </w:tcMar>
+            <w:vAlign w:val="center"/>
+          </w:tcPr>
+          <w:p>
+            <w:pPr>
+              <w:pStyle w:val="Normal"/>
+              <w:jc w:val="left"/>
+              <w:pBdr>
+                <w:bottom w:val="none" w:sz="0" w:space="0" w:color="000000"/>
+                <w:top w:val="none" w:sz="0" w:space="0" w:color="000000"/>
+                <w:left w:val="none" w:sz="0" w:space="0" w:color="000000"/>
+                <w:right w:val="none" w:sz="0" w:space="0" w:color="000000"/>
+              </w:pBdr>
+              <w:spacing w:after="100" w:before="100" w:line="240"/>
+              <w:ind w:left="100" w:right="100" w:firstLine="0" w:firstLineChars="0"/>
+              <w:rPr>
+                <w:rFonts w:ascii="Times New Roman" w:hAnsi="Times New Roman" w:eastAsia="Times New Roman" w:cs="Times New Roman"/>
+                <w:i w:val="false"/>
+                <w:b w:val="false"/>
+                <w:u w:val="none"/>
+                <w:strike w:val="false"/>
+                <w:sz w:val="18"/>
+                <w:szCs w:val="18"/>
+                <w:color w:val="000000"/>
+              </w:rPr>
+            </w:pPr>
+            <w:r>
+              <w:rPr>
+                <w:rFonts w:ascii="Times New Roman" w:hAnsi="Times New Roman" w:eastAsia="Times New Roman" w:cs="Times New Roman"/>
+                <w:i w:val="false"/>
+                <w:b w:val="false"/>
+                <w:u w:val="none"/>
+                <w:strike w:val="false"/>
+                <w:sz w:val="18"/>
+                <w:szCs w:val="18"/>
+                <w:color w:val="000000"/>
+              </w:rPr>
+              <w:t xml:space="preserve">1.10 (0.77–1.56)</w:t>
+            </w:r>
+          </w:p>
+        </w:tc>
+        <w:tc>
+          <w:tcPr>
+            <w:tcBorders>
+              <w:bottom w:val="none" w:sz="0" w:space="0" w:color="000000"/>
+              <w:top w:val="none" w:sz="0" w:space="0" w:color="000000"/>
+              <w:left w:val="none" w:sz="0" w:space="0" w:color="000000"/>
+              <w:right w:val="none" w:sz="0" w:space="0" w:color="000000"/>
+            </w:tcBorders>
+            <w:shd w:val="clear" w:color="auto" w:fill="FFFFFF"/>
+            <w:tcMar>
+              <w:top w:w="0" w:type="dxa"/>
+              <w:bottom w:w="0" w:type="dxa"/>
+              <w:left w:w="0" w:type="dxa"/>
+              <w:right w:w="0" w:type="dxa"/>
+            </w:tcMar>
+            <w:vAlign w:val="center"/>
+          </w:tcPr>
+          <w:p>
+            <w:pPr>
+              <w:pStyle w:val="Normal"/>
+              <w:jc w:val="left"/>
+              <w:pBdr>
+                <w:bottom w:val="none" w:sz="0" w:space="0" w:color="000000"/>
+                <w:top w:val="none" w:sz="0" w:space="0" w:color="000000"/>
+                <w:left w:val="none" w:sz="0" w:space="0" w:color="000000"/>
+                <w:right w:val="none" w:sz="0" w:space="0" w:color="000000"/>
+              </w:pBdr>
+              <w:spacing w:after="100" w:before="100" w:line="240"/>
+              <w:ind w:left="100" w:right="100" w:firstLine="0" w:firstLineChars="0"/>
+              <w:rPr>
+                <w:rFonts w:ascii="Times New Roman" w:hAnsi="Times New Roman" w:eastAsia="Times New Roman" w:cs="Times New Roman"/>
+                <w:i w:val="false"/>
+                <w:b w:val="false"/>
+                <w:u w:val="none"/>
+                <w:strike w:val="false"/>
+                <w:sz w:val="18"/>
+                <w:szCs w:val="18"/>
+                <w:color w:val="000000"/>
+              </w:rPr>
+            </w:pPr>
+            <w:r>
+              <w:rPr>
+                <w:rFonts w:ascii="Times New Roman" w:hAnsi="Times New Roman" w:eastAsia="Times New Roman" w:cs="Times New Roman"/>
+                <w:i w:val="false"/>
+                <w:b w:val="false"/>
+                <w:u w:val="none"/>
+                <w:strike w:val="false"/>
+                <w:sz w:val="18"/>
+                <w:szCs w:val="18"/>
+                <w:color w:val="000000"/>
+              </w:rPr>
+              <w:t xml:space="preserve">0.601</w:t>
             </w:r>
           </w:p>
         </w:tc>
@@ -6495,7 +6495,7 @@
                 <w:szCs w:val="18"/>
                 <w:color w:val="000000"/>
               </w:rPr>
-              <w:t xml:space="preserve">282</w:t>
+              <w:t xml:space="preserve">253</w:t>
             </w:r>
           </w:p>
         </w:tc>
@@ -6550,7 +6550,7 @@
                 <w:szCs w:val="18"/>
                 <w:color w:val="000000"/>
               </w:rPr>
-              <w:t xml:space="preserve">99</w:t>
+              <w:t xml:space="preserve">82</w:t>
             </w:r>
           </w:p>
         </w:tc>
@@ -6940,7 +6940,7 @@
                 <w:szCs w:val="18"/>
                 <w:color w:val="000000"/>
               </w:rPr>
-              <w:t xml:space="preserve">224</w:t>
+              <w:t xml:space="preserve">195</w:t>
             </w:r>
           </w:p>
         </w:tc>
@@ -6995,117 +6995,117 @@
                 <w:szCs w:val="18"/>
                 <w:color w:val="000000"/>
               </w:rPr>
-              <w:t xml:space="preserve">68</w:t>
-            </w:r>
-          </w:p>
-        </w:tc>
-        <w:tc>
-          <w:tcPr>
-            <w:tcBorders>
-              <w:bottom w:val="none" w:sz="0" w:space="0" w:color="000000"/>
-              <w:top w:val="none" w:sz="0" w:space="0" w:color="000000"/>
-              <w:left w:val="none" w:sz="0" w:space="0" w:color="000000"/>
-              <w:right w:val="none" w:sz="0" w:space="0" w:color="000000"/>
-            </w:tcBorders>
-            <w:shd w:val="clear" w:color="auto" w:fill="FFFFFF"/>
-            <w:tcMar>
-              <w:top w:w="0" w:type="dxa"/>
-              <w:bottom w:w="0" w:type="dxa"/>
-              <w:left w:w="0" w:type="dxa"/>
-              <w:right w:w="0" w:type="dxa"/>
-            </w:tcMar>
-            <w:vAlign w:val="center"/>
-          </w:tcPr>
-          <w:p>
-            <w:pPr>
-              <w:pStyle w:val="Normal"/>
-              <w:jc w:val="left"/>
-              <w:pBdr>
-                <w:bottom w:val="none" w:sz="0" w:space="0" w:color="000000"/>
-                <w:top w:val="none" w:sz="0" w:space="0" w:color="000000"/>
-                <w:left w:val="none" w:sz="0" w:space="0" w:color="000000"/>
-                <w:right w:val="none" w:sz="0" w:space="0" w:color="000000"/>
-              </w:pBdr>
-              <w:spacing w:after="100" w:before="100" w:line="240"/>
-              <w:ind w:left="100" w:right="100" w:firstLine="0" w:firstLineChars="0"/>
-              <w:rPr>
-                <w:rFonts w:ascii="Times New Roman" w:hAnsi="Times New Roman" w:eastAsia="Times New Roman" w:cs="Times New Roman"/>
-                <w:i w:val="false"/>
-                <w:b w:val="false"/>
-                <w:u w:val="none"/>
-                <w:strike w:val="false"/>
-                <w:sz w:val="18"/>
-                <w:szCs w:val="18"/>
-                <w:color w:val="000000"/>
-              </w:rPr>
-            </w:pPr>
-            <w:r>
-              <w:rPr>
-                <w:rFonts w:ascii="Times New Roman" w:hAnsi="Times New Roman" w:eastAsia="Times New Roman" w:cs="Times New Roman"/>
-                <w:i w:val="false"/>
-                <w:b w:val="false"/>
-                <w:u w:val="none"/>
-                <w:strike w:val="false"/>
-                <w:sz w:val="18"/>
-                <w:szCs w:val="18"/>
-                <w:color w:val="000000"/>
-              </w:rPr>
-              <w:t xml:space="preserve">0.79 (0.58–1.08)</w:t>
-            </w:r>
-          </w:p>
-        </w:tc>
-        <w:tc>
-          <w:tcPr>
-            <w:tcBorders>
-              <w:bottom w:val="none" w:sz="0" w:space="0" w:color="000000"/>
-              <w:top w:val="none" w:sz="0" w:space="0" w:color="000000"/>
-              <w:left w:val="none" w:sz="0" w:space="0" w:color="000000"/>
-              <w:right w:val="none" w:sz="0" w:space="0" w:color="000000"/>
-            </w:tcBorders>
-            <w:shd w:val="clear" w:color="auto" w:fill="FFFFFF"/>
-            <w:tcMar>
-              <w:top w:w="0" w:type="dxa"/>
-              <w:bottom w:w="0" w:type="dxa"/>
-              <w:left w:w="0" w:type="dxa"/>
-              <w:right w:w="0" w:type="dxa"/>
-            </w:tcMar>
-            <w:vAlign w:val="center"/>
-          </w:tcPr>
-          <w:p>
-            <w:pPr>
-              <w:pStyle w:val="Normal"/>
-              <w:jc w:val="left"/>
-              <w:pBdr>
-                <w:bottom w:val="none" w:sz="0" w:space="0" w:color="000000"/>
-                <w:top w:val="none" w:sz="0" w:space="0" w:color="000000"/>
-                <w:left w:val="none" w:sz="0" w:space="0" w:color="000000"/>
-                <w:right w:val="none" w:sz="0" w:space="0" w:color="000000"/>
-              </w:pBdr>
-              <w:spacing w:after="100" w:before="100" w:line="240"/>
-              <w:ind w:left="100" w:right="100" w:firstLine="0" w:firstLineChars="0"/>
-              <w:rPr>
-                <w:rFonts w:ascii="Times New Roman" w:hAnsi="Times New Roman" w:eastAsia="Times New Roman" w:cs="Times New Roman"/>
-                <w:i w:val="false"/>
-                <w:b w:val="false"/>
-                <w:u w:val="none"/>
-                <w:strike w:val="false"/>
-                <w:sz w:val="18"/>
-                <w:szCs w:val="18"/>
-                <w:color w:val="000000"/>
-              </w:rPr>
-            </w:pPr>
-            <w:r>
-              <w:rPr>
-                <w:rFonts w:ascii="Times New Roman" w:hAnsi="Times New Roman" w:eastAsia="Times New Roman" w:cs="Times New Roman"/>
-                <w:i w:val="false"/>
-                <w:b w:val="false"/>
-                <w:u w:val="none"/>
-                <w:strike w:val="false"/>
-                <w:sz w:val="18"/>
-                <w:szCs w:val="18"/>
-                <w:color w:val="000000"/>
-              </w:rPr>
-              <w:t xml:space="preserve">0.136</w:t>
+              <w:t xml:space="preserve">50</w:t>
+            </w:r>
+          </w:p>
+        </w:tc>
+        <w:tc>
+          <w:tcPr>
+            <w:tcBorders>
+              <w:bottom w:val="none" w:sz="0" w:space="0" w:color="000000"/>
+              <w:top w:val="none" w:sz="0" w:space="0" w:color="000000"/>
+              <w:left w:val="none" w:sz="0" w:space="0" w:color="000000"/>
+              <w:right w:val="none" w:sz="0" w:space="0" w:color="000000"/>
+            </w:tcBorders>
+            <w:shd w:val="clear" w:color="auto" w:fill="FFFFFF"/>
+            <w:tcMar>
+              <w:top w:w="0" w:type="dxa"/>
+              <w:bottom w:w="0" w:type="dxa"/>
+              <w:left w:w="0" w:type="dxa"/>
+              <w:right w:w="0" w:type="dxa"/>
+            </w:tcMar>
+            <w:vAlign w:val="center"/>
+          </w:tcPr>
+          <w:p>
+            <w:pPr>
+              <w:pStyle w:val="Normal"/>
+              <w:jc w:val="left"/>
+              <w:pBdr>
+                <w:bottom w:val="none" w:sz="0" w:space="0" w:color="000000"/>
+                <w:top w:val="none" w:sz="0" w:space="0" w:color="000000"/>
+                <w:left w:val="none" w:sz="0" w:space="0" w:color="000000"/>
+                <w:right w:val="none" w:sz="0" w:space="0" w:color="000000"/>
+              </w:pBdr>
+              <w:spacing w:after="100" w:before="100" w:line="240"/>
+              <w:ind w:left="100" w:right="100" w:firstLine="0" w:firstLineChars="0"/>
+              <w:rPr>
+                <w:rFonts w:ascii="Times New Roman" w:hAnsi="Times New Roman" w:eastAsia="Times New Roman" w:cs="Times New Roman"/>
+                <w:i w:val="false"/>
+                <w:b w:val="false"/>
+                <w:u w:val="none"/>
+                <w:strike w:val="false"/>
+                <w:sz w:val="18"/>
+                <w:szCs w:val="18"/>
+                <w:color w:val="000000"/>
+              </w:rPr>
+            </w:pPr>
+            <w:r>
+              <w:rPr>
+                <w:rFonts w:ascii="Times New Roman" w:hAnsi="Times New Roman" w:eastAsia="Times New Roman" w:cs="Times New Roman"/>
+                <w:i w:val="false"/>
+                <w:b w:val="false"/>
+                <w:u w:val="none"/>
+                <w:strike w:val="false"/>
+                <w:sz w:val="18"/>
+                <w:szCs w:val="18"/>
+                <w:color w:val="000000"/>
+              </w:rPr>
+              <w:t xml:space="preserve">0.75 (0.52–1.06)</w:t>
+            </w:r>
+          </w:p>
+        </w:tc>
+        <w:tc>
+          <w:tcPr>
+            <w:tcBorders>
+              <w:bottom w:val="none" w:sz="0" w:space="0" w:color="000000"/>
+              <w:top w:val="none" w:sz="0" w:space="0" w:color="000000"/>
+              <w:left w:val="none" w:sz="0" w:space="0" w:color="000000"/>
+              <w:right w:val="none" w:sz="0" w:space="0" w:color="000000"/>
+            </w:tcBorders>
+            <w:shd w:val="clear" w:color="auto" w:fill="FFFFFF"/>
+            <w:tcMar>
+              <w:top w:w="0" w:type="dxa"/>
+              <w:bottom w:w="0" w:type="dxa"/>
+              <w:left w:w="0" w:type="dxa"/>
+              <w:right w:w="0" w:type="dxa"/>
+            </w:tcMar>
+            <w:vAlign w:val="center"/>
+          </w:tcPr>
+          <w:p>
+            <w:pPr>
+              <w:pStyle w:val="Normal"/>
+              <w:jc w:val="left"/>
+              <w:pBdr>
+                <w:bottom w:val="none" w:sz="0" w:space="0" w:color="000000"/>
+                <w:top w:val="none" w:sz="0" w:space="0" w:color="000000"/>
+                <w:left w:val="none" w:sz="0" w:space="0" w:color="000000"/>
+                <w:right w:val="none" w:sz="0" w:space="0" w:color="000000"/>
+              </w:pBdr>
+              <w:spacing w:after="100" w:before="100" w:line="240"/>
+              <w:ind w:left="100" w:right="100" w:firstLine="0" w:firstLineChars="0"/>
+              <w:rPr>
+                <w:rFonts w:ascii="Times New Roman" w:hAnsi="Times New Roman" w:eastAsia="Times New Roman" w:cs="Times New Roman"/>
+                <w:i w:val="false"/>
+                <w:b w:val="false"/>
+                <w:u w:val="none"/>
+                <w:strike w:val="false"/>
+                <w:sz w:val="18"/>
+                <w:szCs w:val="18"/>
+                <w:color w:val="000000"/>
+              </w:rPr>
+            </w:pPr>
+            <w:r>
+              <w:rPr>
+                <w:rFonts w:ascii="Times New Roman" w:hAnsi="Times New Roman" w:eastAsia="Times New Roman" w:cs="Times New Roman"/>
+                <w:i w:val="false"/>
+                <w:b w:val="false"/>
+                <w:u w:val="none"/>
+                <w:strike w:val="false"/>
+                <w:sz w:val="18"/>
+                <w:szCs w:val="18"/>
+                <w:color w:val="000000"/>
+              </w:rPr>
+              <w:t xml:space="preserve">0.104</w:t>
             </w:r>
           </w:p>
         </w:tc>
@@ -7830,7 +7830,7 @@
                 <w:szCs w:val="18"/>
                 <w:color w:val="000000"/>
               </w:rPr>
-              <w:t xml:space="preserve">256</w:t>
+              <w:t xml:space="preserve">198</w:t>
             </w:r>
           </w:p>
         </w:tc>
@@ -7885,62 +7885,62 @@
                 <w:szCs w:val="18"/>
                 <w:color w:val="000000"/>
               </w:rPr>
-              <w:t xml:space="preserve">114</w:t>
-            </w:r>
-          </w:p>
-        </w:tc>
-        <w:tc>
-          <w:tcPr>
-            <w:tcBorders>
-              <w:bottom w:val="none" w:sz="0" w:space="0" w:color="000000"/>
-              <w:top w:val="none" w:sz="0" w:space="0" w:color="000000"/>
-              <w:left w:val="none" w:sz="0" w:space="0" w:color="000000"/>
-              <w:right w:val="none" w:sz="0" w:space="0" w:color="000000"/>
-            </w:tcBorders>
-            <w:shd w:val="clear" w:color="auto" w:fill="FFFFFF"/>
-            <w:tcMar>
-              <w:top w:w="0" w:type="dxa"/>
-              <w:bottom w:w="0" w:type="dxa"/>
-              <w:left w:w="0" w:type="dxa"/>
-              <w:right w:w="0" w:type="dxa"/>
-            </w:tcMar>
-            <w:vAlign w:val="center"/>
-          </w:tcPr>
-          <w:p>
-            <w:pPr>
-              <w:pStyle w:val="Normal"/>
-              <w:jc w:val="left"/>
-              <w:pBdr>
-                <w:bottom w:val="none" w:sz="0" w:space="0" w:color="000000"/>
-                <w:top w:val="none" w:sz="0" w:space="0" w:color="000000"/>
-                <w:left w:val="none" w:sz="0" w:space="0" w:color="000000"/>
-                <w:right w:val="none" w:sz="0" w:space="0" w:color="000000"/>
-              </w:pBdr>
-              <w:spacing w:after="100" w:before="100" w:line="240"/>
-              <w:ind w:left="100" w:right="100" w:firstLine="0" w:firstLineChars="0"/>
-              <w:rPr>
-                <w:rFonts w:ascii="Times New Roman" w:hAnsi="Times New Roman" w:eastAsia="Times New Roman" w:cs="Times New Roman"/>
-                <w:i w:val="false"/>
-                <w:b w:val="false"/>
-                <w:u w:val="none"/>
-                <w:strike w:val="false"/>
-                <w:sz w:val="18"/>
-                <w:szCs w:val="18"/>
-                <w:color w:val="000000"/>
-              </w:rPr>
-            </w:pPr>
-            <w:r>
-              <w:rPr>
-                <w:rFonts w:ascii="Times New Roman" w:hAnsi="Times New Roman" w:eastAsia="Times New Roman" w:cs="Times New Roman"/>
-                <w:i w:val="false"/>
-                <w:b w:val="false"/>
-                <w:u w:val="none"/>
-                <w:strike w:val="false"/>
-                <w:sz w:val="18"/>
-                <w:szCs w:val="18"/>
-                <w:color w:val="000000"/>
-              </w:rPr>
-              <w:t xml:space="preserve">2.53 (1.82–3.52)</w:t>
+              <w:t xml:space="preserve">79</w:t>
+            </w:r>
+          </w:p>
+        </w:tc>
+        <w:tc>
+          <w:tcPr>
+            <w:tcBorders>
+              <w:bottom w:val="none" w:sz="0" w:space="0" w:color="000000"/>
+              <w:top w:val="none" w:sz="0" w:space="0" w:color="000000"/>
+              <w:left w:val="none" w:sz="0" w:space="0" w:color="000000"/>
+              <w:right w:val="none" w:sz="0" w:space="0" w:color="000000"/>
+            </w:tcBorders>
+            <w:shd w:val="clear" w:color="auto" w:fill="FFFFFF"/>
+            <w:tcMar>
+              <w:top w:w="0" w:type="dxa"/>
+              <w:bottom w:w="0" w:type="dxa"/>
+              <w:left w:w="0" w:type="dxa"/>
+              <w:right w:w="0" w:type="dxa"/>
+            </w:tcMar>
+            <w:vAlign w:val="center"/>
+          </w:tcPr>
+          <w:p>
+            <w:pPr>
+              <w:pStyle w:val="Normal"/>
+              <w:jc w:val="left"/>
+              <w:pBdr>
+                <w:bottom w:val="none" w:sz="0" w:space="0" w:color="000000"/>
+                <w:top w:val="none" w:sz="0" w:space="0" w:color="000000"/>
+                <w:left w:val="none" w:sz="0" w:space="0" w:color="000000"/>
+                <w:right w:val="none" w:sz="0" w:space="0" w:color="000000"/>
+              </w:pBdr>
+              <w:spacing w:after="100" w:before="100" w:line="240"/>
+              <w:ind w:left="100" w:right="100" w:firstLine="0" w:firstLineChars="0"/>
+              <w:rPr>
+                <w:rFonts w:ascii="Times New Roman" w:hAnsi="Times New Roman" w:eastAsia="Times New Roman" w:cs="Times New Roman"/>
+                <w:i w:val="false"/>
+                <w:b w:val="false"/>
+                <w:u w:val="none"/>
+                <w:strike w:val="false"/>
+                <w:sz w:val="18"/>
+                <w:szCs w:val="18"/>
+                <w:color w:val="000000"/>
+              </w:rPr>
+            </w:pPr>
+            <w:r>
+              <w:rPr>
+                <w:rFonts w:ascii="Times New Roman" w:hAnsi="Times New Roman" w:eastAsia="Times New Roman" w:cs="Times New Roman"/>
+                <w:i w:val="false"/>
+                <w:b w:val="false"/>
+                <w:u w:val="none"/>
+                <w:strike w:val="false"/>
+                <w:sz w:val="18"/>
+                <w:szCs w:val="18"/>
+                <w:color w:val="000000"/>
+              </w:rPr>
+              <w:t xml:space="preserve">2.01 (1.41–2.85)</w:t>
             </w:r>
           </w:p>
         </w:tc>
@@ -8275,7 +8275,7 @@
                 <w:szCs w:val="18"/>
                 <w:color w:val="000000"/>
               </w:rPr>
-              <w:t xml:space="preserve">506</w:t>
+              <w:t xml:space="preserve">448</w:t>
             </w:r>
           </w:p>
         </w:tc>
@@ -8330,117 +8330,117 @@
                 <w:szCs w:val="18"/>
                 <w:color w:val="000000"/>
               </w:rPr>
-              <w:t xml:space="preserve">167</w:t>
-            </w:r>
-          </w:p>
-        </w:tc>
-        <w:tc>
-          <w:tcPr>
-            <w:tcBorders>
-              <w:bottom w:val="none" w:sz="0" w:space="0" w:color="000000"/>
-              <w:top w:val="none" w:sz="0" w:space="0" w:color="000000"/>
-              <w:left w:val="none" w:sz="0" w:space="0" w:color="000000"/>
-              <w:right w:val="none" w:sz="0" w:space="0" w:color="000000"/>
-            </w:tcBorders>
-            <w:shd w:val="clear" w:color="auto" w:fill="FFFFFF"/>
-            <w:tcMar>
-              <w:top w:w="0" w:type="dxa"/>
-              <w:bottom w:w="0" w:type="dxa"/>
-              <w:left w:w="0" w:type="dxa"/>
-              <w:right w:w="0" w:type="dxa"/>
-            </w:tcMar>
-            <w:vAlign w:val="center"/>
-          </w:tcPr>
-          <w:p>
-            <w:pPr>
-              <w:pStyle w:val="Normal"/>
-              <w:jc w:val="left"/>
-              <w:pBdr>
-                <w:bottom w:val="none" w:sz="0" w:space="0" w:color="000000"/>
-                <w:top w:val="none" w:sz="0" w:space="0" w:color="000000"/>
-                <w:left w:val="none" w:sz="0" w:space="0" w:color="000000"/>
-                <w:right w:val="none" w:sz="0" w:space="0" w:color="000000"/>
-              </w:pBdr>
-              <w:spacing w:after="100" w:before="100" w:line="240"/>
-              <w:ind w:left="100" w:right="100" w:firstLine="0" w:firstLineChars="0"/>
-              <w:rPr>
-                <w:rFonts w:ascii="Times New Roman" w:hAnsi="Times New Roman" w:eastAsia="Times New Roman" w:cs="Times New Roman"/>
-                <w:i w:val="false"/>
-                <w:b w:val="false"/>
-                <w:u w:val="none"/>
-                <w:strike w:val="false"/>
-                <w:sz w:val="18"/>
-                <w:szCs w:val="18"/>
-                <w:color w:val="000000"/>
-              </w:rPr>
-            </w:pPr>
-            <w:r>
-              <w:rPr>
-                <w:rFonts w:ascii="Times New Roman" w:hAnsi="Times New Roman" w:eastAsia="Times New Roman" w:cs="Times New Roman"/>
-                <w:i w:val="false"/>
-                <w:b w:val="false"/>
-                <w:u w:val="none"/>
-                <w:strike w:val="false"/>
-                <w:sz w:val="18"/>
-                <w:szCs w:val="18"/>
-                <w:color w:val="000000"/>
-              </w:rPr>
-              <w:t xml:space="preserve">0.85 (0.71–1.00)</w:t>
-            </w:r>
-          </w:p>
-        </w:tc>
-        <w:tc>
-          <w:tcPr>
-            <w:tcBorders>
-              <w:bottom w:val="none" w:sz="0" w:space="0" w:color="000000"/>
-              <w:top w:val="none" w:sz="0" w:space="0" w:color="000000"/>
-              <w:left w:val="none" w:sz="0" w:space="0" w:color="000000"/>
-              <w:right w:val="none" w:sz="0" w:space="0" w:color="000000"/>
-            </w:tcBorders>
-            <w:shd w:val="clear" w:color="auto" w:fill="FFFFFF"/>
-            <w:tcMar>
-              <w:top w:w="0" w:type="dxa"/>
-              <w:bottom w:w="0" w:type="dxa"/>
-              <w:left w:w="0" w:type="dxa"/>
-              <w:right w:w="0" w:type="dxa"/>
-            </w:tcMar>
-            <w:vAlign w:val="center"/>
-          </w:tcPr>
-          <w:p>
-            <w:pPr>
-              <w:pStyle w:val="Normal"/>
-              <w:jc w:val="left"/>
-              <w:pBdr>
-                <w:bottom w:val="none" w:sz="0" w:space="0" w:color="000000"/>
-                <w:top w:val="none" w:sz="0" w:space="0" w:color="000000"/>
-                <w:left w:val="none" w:sz="0" w:space="0" w:color="000000"/>
-                <w:right w:val="none" w:sz="0" w:space="0" w:color="000000"/>
-              </w:pBdr>
-              <w:spacing w:after="100" w:before="100" w:line="240"/>
-              <w:ind w:left="100" w:right="100" w:firstLine="0" w:firstLineChars="0"/>
-              <w:rPr>
-                <w:rFonts w:ascii="Times New Roman" w:hAnsi="Times New Roman" w:eastAsia="Times New Roman" w:cs="Times New Roman"/>
-                <w:i w:val="false"/>
-                <w:b w:val="false"/>
-                <w:u w:val="none"/>
-                <w:strike w:val="false"/>
-                <w:sz w:val="18"/>
-                <w:szCs w:val="18"/>
-                <w:color w:val="000000"/>
-              </w:rPr>
-            </w:pPr>
-            <w:r>
-              <w:rPr>
-                <w:rFonts w:ascii="Times New Roman" w:hAnsi="Times New Roman" w:eastAsia="Times New Roman" w:cs="Times New Roman"/>
-                <w:i w:val="false"/>
-                <w:b w:val="false"/>
-                <w:u w:val="none"/>
-                <w:strike w:val="false"/>
-                <w:sz w:val="18"/>
-                <w:szCs w:val="18"/>
-                <w:color w:val="000000"/>
-              </w:rPr>
-              <w:t xml:space="preserve">0.055</w:t>
+              <w:t xml:space="preserve">132</w:t>
+            </w:r>
+          </w:p>
+        </w:tc>
+        <w:tc>
+          <w:tcPr>
+            <w:tcBorders>
+              <w:bottom w:val="none" w:sz="0" w:space="0" w:color="000000"/>
+              <w:top w:val="none" w:sz="0" w:space="0" w:color="000000"/>
+              <w:left w:val="none" w:sz="0" w:space="0" w:color="000000"/>
+              <w:right w:val="none" w:sz="0" w:space="0" w:color="000000"/>
+            </w:tcBorders>
+            <w:shd w:val="clear" w:color="auto" w:fill="FFFFFF"/>
+            <w:tcMar>
+              <w:top w:w="0" w:type="dxa"/>
+              <w:bottom w:w="0" w:type="dxa"/>
+              <w:left w:w="0" w:type="dxa"/>
+              <w:right w:w="0" w:type="dxa"/>
+            </w:tcMar>
+            <w:vAlign w:val="center"/>
+          </w:tcPr>
+          <w:p>
+            <w:pPr>
+              <w:pStyle w:val="Normal"/>
+              <w:jc w:val="left"/>
+              <w:pBdr>
+                <w:bottom w:val="none" w:sz="0" w:space="0" w:color="000000"/>
+                <w:top w:val="none" w:sz="0" w:space="0" w:color="000000"/>
+                <w:left w:val="none" w:sz="0" w:space="0" w:color="000000"/>
+                <w:right w:val="none" w:sz="0" w:space="0" w:color="000000"/>
+              </w:pBdr>
+              <w:spacing w:after="100" w:before="100" w:line="240"/>
+              <w:ind w:left="100" w:right="100" w:firstLine="0" w:firstLineChars="0"/>
+              <w:rPr>
+                <w:rFonts w:ascii="Times New Roman" w:hAnsi="Times New Roman" w:eastAsia="Times New Roman" w:cs="Times New Roman"/>
+                <w:i w:val="false"/>
+                <w:b w:val="false"/>
+                <w:u w:val="none"/>
+                <w:strike w:val="false"/>
+                <w:sz w:val="18"/>
+                <w:szCs w:val="18"/>
+                <w:color w:val="000000"/>
+              </w:rPr>
+            </w:pPr>
+            <w:r>
+              <w:rPr>
+                <w:rFonts w:ascii="Times New Roman" w:hAnsi="Times New Roman" w:eastAsia="Times New Roman" w:cs="Times New Roman"/>
+                <w:i w:val="false"/>
+                <w:b w:val="false"/>
+                <w:u w:val="none"/>
+                <w:strike w:val="false"/>
+                <w:sz w:val="18"/>
+                <w:szCs w:val="18"/>
+                <w:color w:val="000000"/>
+              </w:rPr>
+              <w:t xml:space="preserve">0.79 (0.65–0.96)</w:t>
+            </w:r>
+          </w:p>
+        </w:tc>
+        <w:tc>
+          <w:tcPr>
+            <w:tcBorders>
+              <w:bottom w:val="none" w:sz="0" w:space="0" w:color="000000"/>
+              <w:top w:val="none" w:sz="0" w:space="0" w:color="000000"/>
+              <w:left w:val="none" w:sz="0" w:space="0" w:color="000000"/>
+              <w:right w:val="none" w:sz="0" w:space="0" w:color="000000"/>
+            </w:tcBorders>
+            <w:shd w:val="clear" w:color="auto" w:fill="FFFFFF"/>
+            <w:tcMar>
+              <w:top w:w="0" w:type="dxa"/>
+              <w:bottom w:w="0" w:type="dxa"/>
+              <w:left w:w="0" w:type="dxa"/>
+              <w:right w:w="0" w:type="dxa"/>
+            </w:tcMar>
+            <w:vAlign w:val="center"/>
+          </w:tcPr>
+          <w:p>
+            <w:pPr>
+              <w:pStyle w:val="Normal"/>
+              <w:jc w:val="left"/>
+              <w:pBdr>
+                <w:bottom w:val="none" w:sz="0" w:space="0" w:color="000000"/>
+                <w:top w:val="none" w:sz="0" w:space="0" w:color="000000"/>
+                <w:left w:val="none" w:sz="0" w:space="0" w:color="000000"/>
+                <w:right w:val="none" w:sz="0" w:space="0" w:color="000000"/>
+              </w:pBdr>
+              <w:spacing w:after="100" w:before="100" w:line="240"/>
+              <w:ind w:left="100" w:right="100" w:firstLine="0" w:firstLineChars="0"/>
+              <w:rPr>
+                <w:rFonts w:ascii="Times New Roman" w:hAnsi="Times New Roman" w:eastAsia="Times New Roman" w:cs="Times New Roman"/>
+                <w:i w:val="false"/>
+                <w:b w:val="false"/>
+                <w:u w:val="none"/>
+                <w:strike w:val="false"/>
+                <w:sz w:val="18"/>
+                <w:szCs w:val="18"/>
+                <w:color w:val="000000"/>
+              </w:rPr>
+            </w:pPr>
+            <w:r>
+              <w:rPr>
+                <w:rFonts w:ascii="Times New Roman" w:hAnsi="Times New Roman" w:eastAsia="Times New Roman" w:cs="Times New Roman"/>
+                <w:i w:val="false"/>
+                <w:b w:val="false"/>
+                <w:u w:val="none"/>
+                <w:strike w:val="false"/>
+                <w:sz w:val="18"/>
+                <w:szCs w:val="18"/>
+                <w:color w:val="000000"/>
+              </w:rPr>
+              <w:t xml:space="preserve">0.015</w:t>
             </w:r>
           </w:p>
         </w:tc>
@@ -8720,7 +8720,7 @@
                 <w:szCs w:val="18"/>
                 <w:color w:val="000000"/>
               </w:rPr>
-              <w:t xml:space="preserve">204</w:t>
+              <w:t xml:space="preserve">171</w:t>
             </w:r>
           </w:p>
         </w:tc>
@@ -8775,7 +8775,7 @@
                 <w:szCs w:val="18"/>
                 <w:color w:val="000000"/>
               </w:rPr>
-              <w:t xml:space="preserve">72</w:t>
+              <w:t xml:space="preserve">52</w:t>
             </w:r>
           </w:p>
         </w:tc>
@@ -9165,7 +9165,7 @@
                 <w:szCs w:val="18"/>
                 <w:color w:val="000000"/>
               </w:rPr>
-              <w:t xml:space="preserve">302</w:t>
+              <w:t xml:space="preserve">277</w:t>
             </w:r>
           </w:p>
         </w:tc>
@@ -9220,117 +9220,117 @@
                 <w:szCs w:val="18"/>
                 <w:color w:val="000000"/>
               </w:rPr>
-              <w:t xml:space="preserve">95</w:t>
-            </w:r>
-          </w:p>
-        </w:tc>
-        <w:tc>
-          <w:tcPr>
-            <w:tcBorders>
-              <w:bottom w:val="none" w:sz="0" w:space="0" w:color="000000"/>
-              <w:top w:val="none" w:sz="0" w:space="0" w:color="000000"/>
-              <w:left w:val="none" w:sz="0" w:space="0" w:color="000000"/>
-              <w:right w:val="none" w:sz="0" w:space="0" w:color="000000"/>
-            </w:tcBorders>
-            <w:shd w:val="clear" w:color="auto" w:fill="FFFFFF"/>
-            <w:tcMar>
-              <w:top w:w="0" w:type="dxa"/>
-              <w:bottom w:w="0" w:type="dxa"/>
-              <w:left w:w="0" w:type="dxa"/>
-              <w:right w:w="0" w:type="dxa"/>
-            </w:tcMar>
-            <w:vAlign w:val="center"/>
-          </w:tcPr>
-          <w:p>
-            <w:pPr>
-              <w:pStyle w:val="Normal"/>
-              <w:jc w:val="left"/>
-              <w:pBdr>
-                <w:bottom w:val="none" w:sz="0" w:space="0" w:color="000000"/>
-                <w:top w:val="none" w:sz="0" w:space="0" w:color="000000"/>
-                <w:left w:val="none" w:sz="0" w:space="0" w:color="000000"/>
-                <w:right w:val="none" w:sz="0" w:space="0" w:color="000000"/>
-              </w:pBdr>
-              <w:spacing w:after="100" w:before="100" w:line="240"/>
-              <w:ind w:left="100" w:right="100" w:firstLine="0" w:firstLineChars="0"/>
-              <w:rPr>
-                <w:rFonts w:ascii="Times New Roman" w:hAnsi="Times New Roman" w:eastAsia="Times New Roman" w:cs="Times New Roman"/>
-                <w:i w:val="false"/>
-                <w:b w:val="false"/>
-                <w:u w:val="none"/>
-                <w:strike w:val="false"/>
-                <w:sz w:val="18"/>
-                <w:szCs w:val="18"/>
-                <w:color w:val="000000"/>
-              </w:rPr>
-            </w:pPr>
-            <w:r>
-              <w:rPr>
-                <w:rFonts w:ascii="Times New Roman" w:hAnsi="Times New Roman" w:eastAsia="Times New Roman" w:cs="Times New Roman"/>
-                <w:i w:val="false"/>
-                <w:b w:val="false"/>
-                <w:u w:val="none"/>
-                <w:strike w:val="false"/>
-                <w:sz w:val="18"/>
-                <w:szCs w:val="18"/>
-                <w:color w:val="000000"/>
-              </w:rPr>
-              <w:t xml:space="preserve">1.00 (0.73–1.36)</w:t>
-            </w:r>
-          </w:p>
-        </w:tc>
-        <w:tc>
-          <w:tcPr>
-            <w:tcBorders>
-              <w:bottom w:val="none" w:sz="0" w:space="0" w:color="000000"/>
-              <w:top w:val="none" w:sz="0" w:space="0" w:color="000000"/>
-              <w:left w:val="none" w:sz="0" w:space="0" w:color="000000"/>
-              <w:right w:val="none" w:sz="0" w:space="0" w:color="000000"/>
-            </w:tcBorders>
-            <w:shd w:val="clear" w:color="auto" w:fill="FFFFFF"/>
-            <w:tcMar>
-              <w:top w:w="0" w:type="dxa"/>
-              <w:bottom w:w="0" w:type="dxa"/>
-              <w:left w:w="0" w:type="dxa"/>
-              <w:right w:w="0" w:type="dxa"/>
-            </w:tcMar>
-            <w:vAlign w:val="center"/>
-          </w:tcPr>
-          <w:p>
-            <w:pPr>
-              <w:pStyle w:val="Normal"/>
-              <w:jc w:val="left"/>
-              <w:pBdr>
-                <w:bottom w:val="none" w:sz="0" w:space="0" w:color="000000"/>
-                <w:top w:val="none" w:sz="0" w:space="0" w:color="000000"/>
-                <w:left w:val="none" w:sz="0" w:space="0" w:color="000000"/>
-                <w:right w:val="none" w:sz="0" w:space="0" w:color="000000"/>
-              </w:pBdr>
-              <w:spacing w:after="100" w:before="100" w:line="240"/>
-              <w:ind w:left="100" w:right="100" w:firstLine="0" w:firstLineChars="0"/>
-              <w:rPr>
-                <w:rFonts w:ascii="Times New Roman" w:hAnsi="Times New Roman" w:eastAsia="Times New Roman" w:cs="Times New Roman"/>
-                <w:i w:val="false"/>
-                <w:b w:val="false"/>
-                <w:u w:val="none"/>
-                <w:strike w:val="false"/>
-                <w:sz w:val="18"/>
-                <w:szCs w:val="18"/>
-                <w:color w:val="000000"/>
-              </w:rPr>
-            </w:pPr>
-            <w:r>
-              <w:rPr>
-                <w:rFonts w:ascii="Times New Roman" w:hAnsi="Times New Roman" w:eastAsia="Times New Roman" w:cs="Times New Roman"/>
-                <w:i w:val="false"/>
-                <w:b w:val="false"/>
-                <w:u w:val="none"/>
-                <w:strike w:val="false"/>
-                <w:sz w:val="18"/>
-                <w:szCs w:val="18"/>
-                <w:color w:val="000000"/>
-              </w:rPr>
-              <w:t xml:space="preserve">0.999</w:t>
+              <w:t xml:space="preserve">80</w:t>
+            </w:r>
+          </w:p>
+        </w:tc>
+        <w:tc>
+          <w:tcPr>
+            <w:tcBorders>
+              <w:bottom w:val="none" w:sz="0" w:space="0" w:color="000000"/>
+              <w:top w:val="none" w:sz="0" w:space="0" w:color="000000"/>
+              <w:left w:val="none" w:sz="0" w:space="0" w:color="000000"/>
+              <w:right w:val="none" w:sz="0" w:space="0" w:color="000000"/>
+            </w:tcBorders>
+            <w:shd w:val="clear" w:color="auto" w:fill="FFFFFF"/>
+            <w:tcMar>
+              <w:top w:w="0" w:type="dxa"/>
+              <w:bottom w:w="0" w:type="dxa"/>
+              <w:left w:w="0" w:type="dxa"/>
+              <w:right w:w="0" w:type="dxa"/>
+            </w:tcMar>
+            <w:vAlign w:val="center"/>
+          </w:tcPr>
+          <w:p>
+            <w:pPr>
+              <w:pStyle w:val="Normal"/>
+              <w:jc w:val="left"/>
+              <w:pBdr>
+                <w:bottom w:val="none" w:sz="0" w:space="0" w:color="000000"/>
+                <w:top w:val="none" w:sz="0" w:space="0" w:color="000000"/>
+                <w:left w:val="none" w:sz="0" w:space="0" w:color="000000"/>
+                <w:right w:val="none" w:sz="0" w:space="0" w:color="000000"/>
+              </w:pBdr>
+              <w:spacing w:after="100" w:before="100" w:line="240"/>
+              <w:ind w:left="100" w:right="100" w:firstLine="0" w:firstLineChars="0"/>
+              <w:rPr>
+                <w:rFonts w:ascii="Times New Roman" w:hAnsi="Times New Roman" w:eastAsia="Times New Roman" w:cs="Times New Roman"/>
+                <w:i w:val="false"/>
+                <w:b w:val="false"/>
+                <w:u w:val="none"/>
+                <w:strike w:val="false"/>
+                <w:sz w:val="18"/>
+                <w:szCs w:val="18"/>
+                <w:color w:val="000000"/>
+              </w:rPr>
+            </w:pPr>
+            <w:r>
+              <w:rPr>
+                <w:rFonts w:ascii="Times New Roman" w:hAnsi="Times New Roman" w:eastAsia="Times New Roman" w:cs="Times New Roman"/>
+                <w:i w:val="false"/>
+                <w:b w:val="false"/>
+                <w:u w:val="none"/>
+                <w:strike w:val="false"/>
+                <w:sz w:val="18"/>
+                <w:szCs w:val="18"/>
+                <w:color w:val="000000"/>
+              </w:rPr>
+              <w:t xml:space="preserve">1.12 (0.78–1.59)</w:t>
+            </w:r>
+          </w:p>
+        </w:tc>
+        <w:tc>
+          <w:tcPr>
+            <w:tcBorders>
+              <w:bottom w:val="none" w:sz="0" w:space="0" w:color="000000"/>
+              <w:top w:val="none" w:sz="0" w:space="0" w:color="000000"/>
+              <w:left w:val="none" w:sz="0" w:space="0" w:color="000000"/>
+              <w:right w:val="none" w:sz="0" w:space="0" w:color="000000"/>
+            </w:tcBorders>
+            <w:shd w:val="clear" w:color="auto" w:fill="FFFFFF"/>
+            <w:tcMar>
+              <w:top w:w="0" w:type="dxa"/>
+              <w:bottom w:w="0" w:type="dxa"/>
+              <w:left w:w="0" w:type="dxa"/>
+              <w:right w:w="0" w:type="dxa"/>
+            </w:tcMar>
+            <w:vAlign w:val="center"/>
+          </w:tcPr>
+          <w:p>
+            <w:pPr>
+              <w:pStyle w:val="Normal"/>
+              <w:jc w:val="left"/>
+              <w:pBdr>
+                <w:bottom w:val="none" w:sz="0" w:space="0" w:color="000000"/>
+                <w:top w:val="none" w:sz="0" w:space="0" w:color="000000"/>
+                <w:left w:val="none" w:sz="0" w:space="0" w:color="000000"/>
+                <w:right w:val="none" w:sz="0" w:space="0" w:color="000000"/>
+              </w:pBdr>
+              <w:spacing w:after="100" w:before="100" w:line="240"/>
+              <w:ind w:left="100" w:right="100" w:firstLine="0" w:firstLineChars="0"/>
+              <w:rPr>
+                <w:rFonts w:ascii="Times New Roman" w:hAnsi="Times New Roman" w:eastAsia="Times New Roman" w:cs="Times New Roman"/>
+                <w:i w:val="false"/>
+                <w:b w:val="false"/>
+                <w:u w:val="none"/>
+                <w:strike w:val="false"/>
+                <w:sz w:val="18"/>
+                <w:szCs w:val="18"/>
+                <w:color w:val="000000"/>
+              </w:rPr>
+            </w:pPr>
+            <w:r>
+              <w:rPr>
+                <w:rFonts w:ascii="Times New Roman" w:hAnsi="Times New Roman" w:eastAsia="Times New Roman" w:cs="Times New Roman"/>
+                <w:i w:val="false"/>
+                <w:b w:val="false"/>
+                <w:u w:val="none"/>
+                <w:strike w:val="false"/>
+                <w:sz w:val="18"/>
+                <w:szCs w:val="18"/>
+                <w:color w:val="000000"/>
+              </w:rPr>
+              <w:t xml:space="preserve">0.541</w:t>
             </w:r>
           </w:p>
         </w:tc>
@@ -9610,7 +9610,7 @@
                 <w:szCs w:val="18"/>
                 <w:color w:val="000000"/>
               </w:rPr>
-              <w:t xml:space="preserve">282</w:t>
+              <w:t xml:space="preserve">253</w:t>
             </w:r>
           </w:p>
         </w:tc>
@@ -9665,7 +9665,7 @@
                 <w:szCs w:val="18"/>
                 <w:color w:val="000000"/>
               </w:rPr>
-              <w:t xml:space="preserve">99</w:t>
+              <w:t xml:space="preserve">82</w:t>
             </w:r>
           </w:p>
         </w:tc>
@@ -10055,7 +10055,7 @@
                 <w:szCs w:val="18"/>
                 <w:color w:val="000000"/>
               </w:rPr>
-              <w:t xml:space="preserve">224</w:t>
+              <w:t xml:space="preserve">195</w:t>
             </w:r>
           </w:p>
         </w:tc>
@@ -10110,117 +10110,117 @@
                 <w:szCs w:val="18"/>
                 <w:color w:val="000000"/>
               </w:rPr>
-              <w:t xml:space="preserve">68</w:t>
-            </w:r>
-          </w:p>
-        </w:tc>
-        <w:tc>
-          <w:tcPr>
-            <w:tcBorders>
-              <w:bottom w:val="none" w:sz="0" w:space="0" w:color="000000"/>
-              <w:top w:val="none" w:sz="0" w:space="0" w:color="000000"/>
-              <w:left w:val="none" w:sz="0" w:space="0" w:color="000000"/>
-              <w:right w:val="none" w:sz="0" w:space="0" w:color="000000"/>
-            </w:tcBorders>
-            <w:shd w:val="clear" w:color="auto" w:fill="FFFFFF"/>
-            <w:tcMar>
-              <w:top w:w="0" w:type="dxa"/>
-              <w:bottom w:w="0" w:type="dxa"/>
-              <w:left w:w="0" w:type="dxa"/>
-              <w:right w:w="0" w:type="dxa"/>
-            </w:tcMar>
-            <w:vAlign w:val="center"/>
-          </w:tcPr>
-          <w:p>
-            <w:pPr>
-              <w:pStyle w:val="Normal"/>
-              <w:jc w:val="left"/>
-              <w:pBdr>
-                <w:bottom w:val="none" w:sz="0" w:space="0" w:color="000000"/>
-                <w:top w:val="none" w:sz="0" w:space="0" w:color="000000"/>
-                <w:left w:val="none" w:sz="0" w:space="0" w:color="000000"/>
-                <w:right w:val="none" w:sz="0" w:space="0" w:color="000000"/>
-              </w:pBdr>
-              <w:spacing w:after="100" w:before="100" w:line="240"/>
-              <w:ind w:left="100" w:right="100" w:firstLine="0" w:firstLineChars="0"/>
-              <w:rPr>
-                <w:rFonts w:ascii="Times New Roman" w:hAnsi="Times New Roman" w:eastAsia="Times New Roman" w:cs="Times New Roman"/>
-                <w:i w:val="false"/>
-                <w:b w:val="false"/>
-                <w:u w:val="none"/>
-                <w:strike w:val="false"/>
-                <w:sz w:val="18"/>
-                <w:szCs w:val="18"/>
-                <w:color w:val="000000"/>
-              </w:rPr>
-            </w:pPr>
-            <w:r>
-              <w:rPr>
-                <w:rFonts w:ascii="Times New Roman" w:hAnsi="Times New Roman" w:eastAsia="Times New Roman" w:cs="Times New Roman"/>
-                <w:i w:val="false"/>
-                <w:b w:val="false"/>
-                <w:u w:val="none"/>
-                <w:strike w:val="false"/>
-                <w:sz w:val="18"/>
-                <w:szCs w:val="18"/>
-                <w:color w:val="000000"/>
-              </w:rPr>
-              <w:t xml:space="preserve">0.81 (0.59–1.10)</w:t>
-            </w:r>
-          </w:p>
-        </w:tc>
-        <w:tc>
-          <w:tcPr>
-            <w:tcBorders>
-              <w:bottom w:val="none" w:sz="0" w:space="0" w:color="000000"/>
-              <w:top w:val="none" w:sz="0" w:space="0" w:color="000000"/>
-              <w:left w:val="none" w:sz="0" w:space="0" w:color="000000"/>
-              <w:right w:val="none" w:sz="0" w:space="0" w:color="000000"/>
-            </w:tcBorders>
-            <w:shd w:val="clear" w:color="auto" w:fill="FFFFFF"/>
-            <w:tcMar>
-              <w:top w:w="0" w:type="dxa"/>
-              <w:bottom w:w="0" w:type="dxa"/>
-              <w:left w:w="0" w:type="dxa"/>
-              <w:right w:w="0" w:type="dxa"/>
-            </w:tcMar>
-            <w:vAlign w:val="center"/>
-          </w:tcPr>
-          <w:p>
-            <w:pPr>
-              <w:pStyle w:val="Normal"/>
-              <w:jc w:val="left"/>
-              <w:pBdr>
-                <w:bottom w:val="none" w:sz="0" w:space="0" w:color="000000"/>
-                <w:top w:val="none" w:sz="0" w:space="0" w:color="000000"/>
-                <w:left w:val="none" w:sz="0" w:space="0" w:color="000000"/>
-                <w:right w:val="none" w:sz="0" w:space="0" w:color="000000"/>
-              </w:pBdr>
-              <w:spacing w:after="100" w:before="100" w:line="240"/>
-              <w:ind w:left="100" w:right="100" w:firstLine="0" w:firstLineChars="0"/>
-              <w:rPr>
-                <w:rFonts w:ascii="Times New Roman" w:hAnsi="Times New Roman" w:eastAsia="Times New Roman" w:cs="Times New Roman"/>
-                <w:i w:val="false"/>
-                <w:b w:val="false"/>
-                <w:u w:val="none"/>
-                <w:strike w:val="false"/>
-                <w:sz w:val="18"/>
-                <w:szCs w:val="18"/>
-                <w:color w:val="000000"/>
-              </w:rPr>
-            </w:pPr>
-            <w:r>
-              <w:rPr>
-                <w:rFonts w:ascii="Times New Roman" w:hAnsi="Times New Roman" w:eastAsia="Times New Roman" w:cs="Times New Roman"/>
-                <w:i w:val="false"/>
-                <w:b w:val="false"/>
-                <w:u w:val="none"/>
-                <w:strike w:val="false"/>
-                <w:sz w:val="18"/>
-                <w:szCs w:val="18"/>
-                <w:color w:val="000000"/>
-              </w:rPr>
-              <w:t xml:space="preserve">0.181</w:t>
+              <w:t xml:space="preserve">50</w:t>
+            </w:r>
+          </w:p>
+        </w:tc>
+        <w:tc>
+          <w:tcPr>
+            <w:tcBorders>
+              <w:bottom w:val="none" w:sz="0" w:space="0" w:color="000000"/>
+              <w:top w:val="none" w:sz="0" w:space="0" w:color="000000"/>
+              <w:left w:val="none" w:sz="0" w:space="0" w:color="000000"/>
+              <w:right w:val="none" w:sz="0" w:space="0" w:color="000000"/>
+            </w:tcBorders>
+            <w:shd w:val="clear" w:color="auto" w:fill="FFFFFF"/>
+            <w:tcMar>
+              <w:top w:w="0" w:type="dxa"/>
+              <w:bottom w:w="0" w:type="dxa"/>
+              <w:left w:w="0" w:type="dxa"/>
+              <w:right w:w="0" w:type="dxa"/>
+            </w:tcMar>
+            <w:vAlign w:val="center"/>
+          </w:tcPr>
+          <w:p>
+            <w:pPr>
+              <w:pStyle w:val="Normal"/>
+              <w:jc w:val="left"/>
+              <w:pBdr>
+                <w:bottom w:val="none" w:sz="0" w:space="0" w:color="000000"/>
+                <w:top w:val="none" w:sz="0" w:space="0" w:color="000000"/>
+                <w:left w:val="none" w:sz="0" w:space="0" w:color="000000"/>
+                <w:right w:val="none" w:sz="0" w:space="0" w:color="000000"/>
+              </w:pBdr>
+              <w:spacing w:after="100" w:before="100" w:line="240"/>
+              <w:ind w:left="100" w:right="100" w:firstLine="0" w:firstLineChars="0"/>
+              <w:rPr>
+                <w:rFonts w:ascii="Times New Roman" w:hAnsi="Times New Roman" w:eastAsia="Times New Roman" w:cs="Times New Roman"/>
+                <w:i w:val="false"/>
+                <w:b w:val="false"/>
+                <w:u w:val="none"/>
+                <w:strike w:val="false"/>
+                <w:sz w:val="18"/>
+                <w:szCs w:val="18"/>
+                <w:color w:val="000000"/>
+              </w:rPr>
+            </w:pPr>
+            <w:r>
+              <w:rPr>
+                <w:rFonts w:ascii="Times New Roman" w:hAnsi="Times New Roman" w:eastAsia="Times New Roman" w:cs="Times New Roman"/>
+                <w:i w:val="false"/>
+                <w:b w:val="false"/>
+                <w:u w:val="none"/>
+                <w:strike w:val="false"/>
+                <w:sz w:val="18"/>
+                <w:szCs w:val="18"/>
+                <w:color w:val="000000"/>
+              </w:rPr>
+              <w:t xml:space="preserve">0.76 (0.54–1.09)</w:t>
+            </w:r>
+          </w:p>
+        </w:tc>
+        <w:tc>
+          <w:tcPr>
+            <w:tcBorders>
+              <w:bottom w:val="none" w:sz="0" w:space="0" w:color="000000"/>
+              <w:top w:val="none" w:sz="0" w:space="0" w:color="000000"/>
+              <w:left w:val="none" w:sz="0" w:space="0" w:color="000000"/>
+              <w:right w:val="none" w:sz="0" w:space="0" w:color="000000"/>
+            </w:tcBorders>
+            <w:shd w:val="clear" w:color="auto" w:fill="FFFFFF"/>
+            <w:tcMar>
+              <w:top w:w="0" w:type="dxa"/>
+              <w:bottom w:w="0" w:type="dxa"/>
+              <w:left w:w="0" w:type="dxa"/>
+              <w:right w:w="0" w:type="dxa"/>
+            </w:tcMar>
+            <w:vAlign w:val="center"/>
+          </w:tcPr>
+          <w:p>
+            <w:pPr>
+              <w:pStyle w:val="Normal"/>
+              <w:jc w:val="left"/>
+              <w:pBdr>
+                <w:bottom w:val="none" w:sz="0" w:space="0" w:color="000000"/>
+                <w:top w:val="none" w:sz="0" w:space="0" w:color="000000"/>
+                <w:left w:val="none" w:sz="0" w:space="0" w:color="000000"/>
+                <w:right w:val="none" w:sz="0" w:space="0" w:color="000000"/>
+              </w:pBdr>
+              <w:spacing w:after="100" w:before="100" w:line="240"/>
+              <w:ind w:left="100" w:right="100" w:firstLine="0" w:firstLineChars="0"/>
+              <w:rPr>
+                <w:rFonts w:ascii="Times New Roman" w:hAnsi="Times New Roman" w:eastAsia="Times New Roman" w:cs="Times New Roman"/>
+                <w:i w:val="false"/>
+                <w:b w:val="false"/>
+                <w:u w:val="none"/>
+                <w:strike w:val="false"/>
+                <w:sz w:val="18"/>
+                <w:szCs w:val="18"/>
+                <w:color w:val="000000"/>
+              </w:rPr>
+            </w:pPr>
+            <w:r>
+              <w:rPr>
+                <w:rFonts w:ascii="Times New Roman" w:hAnsi="Times New Roman" w:eastAsia="Times New Roman" w:cs="Times New Roman"/>
+                <w:i w:val="false"/>
+                <w:b w:val="false"/>
+                <w:u w:val="none"/>
+                <w:strike w:val="false"/>
+                <w:sz w:val="18"/>
+                <w:szCs w:val="18"/>
+                <w:color w:val="000000"/>
+              </w:rPr>
+              <w:t xml:space="preserve">0.136</w:t>
             </w:r>
           </w:p>
         </w:tc>
@@ -10945,7 +10945,7 @@
                 <w:szCs w:val="18"/>
                 <w:color w:val="000000"/>
               </w:rPr>
-              <w:t xml:space="preserve">256</w:t>
+              <w:t xml:space="preserve">198</w:t>
             </w:r>
           </w:p>
         </w:tc>
@@ -11000,62 +11000,62 @@
                 <w:szCs w:val="18"/>
                 <w:color w:val="000000"/>
               </w:rPr>
-              <w:t xml:space="preserve">114</w:t>
-            </w:r>
-          </w:p>
-        </w:tc>
-        <w:tc>
-          <w:tcPr>
-            <w:tcBorders>
-              <w:bottom w:val="none" w:sz="0" w:space="0" w:color="000000"/>
-              <w:top w:val="none" w:sz="0" w:space="0" w:color="000000"/>
-              <w:left w:val="none" w:sz="0" w:space="0" w:color="000000"/>
-              <w:right w:val="none" w:sz="0" w:space="0" w:color="000000"/>
-            </w:tcBorders>
-            <w:shd w:val="clear" w:color="auto" w:fill="FFFFFF"/>
-            <w:tcMar>
-              <w:top w:w="0" w:type="dxa"/>
-              <w:bottom w:w="0" w:type="dxa"/>
-              <w:left w:w="0" w:type="dxa"/>
-              <w:right w:w="0" w:type="dxa"/>
-            </w:tcMar>
-            <w:vAlign w:val="center"/>
-          </w:tcPr>
-          <w:p>
-            <w:pPr>
-              <w:pStyle w:val="Normal"/>
-              <w:jc w:val="left"/>
-              <w:pBdr>
-                <w:bottom w:val="none" w:sz="0" w:space="0" w:color="000000"/>
-                <w:top w:val="none" w:sz="0" w:space="0" w:color="000000"/>
-                <w:left w:val="none" w:sz="0" w:space="0" w:color="000000"/>
-                <w:right w:val="none" w:sz="0" w:space="0" w:color="000000"/>
-              </w:pBdr>
-              <w:spacing w:after="100" w:before="100" w:line="240"/>
-              <w:ind w:left="100" w:right="100" w:firstLine="0" w:firstLineChars="0"/>
-              <w:rPr>
-                <w:rFonts w:ascii="Times New Roman" w:hAnsi="Times New Roman" w:eastAsia="Times New Roman" w:cs="Times New Roman"/>
-                <w:i w:val="false"/>
-                <w:b w:val="false"/>
-                <w:u w:val="none"/>
-                <w:strike w:val="false"/>
-                <w:sz w:val="18"/>
-                <w:szCs w:val="18"/>
-                <w:color w:val="000000"/>
-              </w:rPr>
-            </w:pPr>
-            <w:r>
-              <w:rPr>
-                <w:rFonts w:ascii="Times New Roman" w:hAnsi="Times New Roman" w:eastAsia="Times New Roman" w:cs="Times New Roman"/>
-                <w:i w:val="false"/>
-                <w:b w:val="false"/>
-                <w:u w:val="none"/>
-                <w:strike w:val="false"/>
-                <w:sz w:val="18"/>
-                <w:szCs w:val="18"/>
-                <w:color w:val="000000"/>
-              </w:rPr>
-              <w:t xml:space="preserve">2.49 (1.79–3.46)</w:t>
+              <w:t xml:space="preserve">79</w:t>
+            </w:r>
+          </w:p>
+        </w:tc>
+        <w:tc>
+          <w:tcPr>
+            <w:tcBorders>
+              <w:bottom w:val="none" w:sz="0" w:space="0" w:color="000000"/>
+              <w:top w:val="none" w:sz="0" w:space="0" w:color="000000"/>
+              <w:left w:val="none" w:sz="0" w:space="0" w:color="000000"/>
+              <w:right w:val="none" w:sz="0" w:space="0" w:color="000000"/>
+            </w:tcBorders>
+            <w:shd w:val="clear" w:color="auto" w:fill="FFFFFF"/>
+            <w:tcMar>
+              <w:top w:w="0" w:type="dxa"/>
+              <w:bottom w:w="0" w:type="dxa"/>
+              <w:left w:w="0" w:type="dxa"/>
+              <w:right w:w="0" w:type="dxa"/>
+            </w:tcMar>
+            <w:vAlign w:val="center"/>
+          </w:tcPr>
+          <w:p>
+            <w:pPr>
+              <w:pStyle w:val="Normal"/>
+              <w:jc w:val="left"/>
+              <w:pBdr>
+                <w:bottom w:val="none" w:sz="0" w:space="0" w:color="000000"/>
+                <w:top w:val="none" w:sz="0" w:space="0" w:color="000000"/>
+                <w:left w:val="none" w:sz="0" w:space="0" w:color="000000"/>
+                <w:right w:val="none" w:sz="0" w:space="0" w:color="000000"/>
+              </w:pBdr>
+              <w:spacing w:after="100" w:before="100" w:line="240"/>
+              <w:ind w:left="100" w:right="100" w:firstLine="0" w:firstLineChars="0"/>
+              <w:rPr>
+                <w:rFonts w:ascii="Times New Roman" w:hAnsi="Times New Roman" w:eastAsia="Times New Roman" w:cs="Times New Roman"/>
+                <w:i w:val="false"/>
+                <w:b w:val="false"/>
+                <w:u w:val="none"/>
+                <w:strike w:val="false"/>
+                <w:sz w:val="18"/>
+                <w:szCs w:val="18"/>
+                <w:color w:val="000000"/>
+              </w:rPr>
+            </w:pPr>
+            <w:r>
+              <w:rPr>
+                <w:rFonts w:ascii="Times New Roman" w:hAnsi="Times New Roman" w:eastAsia="Times New Roman" w:cs="Times New Roman"/>
+                <w:i w:val="false"/>
+                <w:b w:val="false"/>
+                <w:u w:val="none"/>
+                <w:strike w:val="false"/>
+                <w:sz w:val="18"/>
+                <w:szCs w:val="18"/>
+                <w:color w:val="000000"/>
+              </w:rPr>
+              <w:t xml:space="preserve">1.99 (1.40–2.83)</w:t>
             </w:r>
           </w:p>
         </w:tc>
@@ -11390,7 +11390,7 @@
                 <w:szCs w:val="18"/>
                 <w:color w:val="000000"/>
               </w:rPr>
-              <w:t xml:space="preserve">435</w:t>
+              <w:t xml:space="preserve">379</w:t>
             </w:r>
           </w:p>
         </w:tc>
@@ -11445,7 +11445,7 @@
                 <w:szCs w:val="18"/>
                 <w:color w:val="000000"/>
               </w:rPr>
-              <w:t xml:space="preserve">157</w:t>
+              <w:t xml:space="preserve">122</w:t>
             </w:r>
           </w:p>
         </w:tc>
@@ -11835,7 +11835,7 @@
                 <w:szCs w:val="18"/>
                 <w:color w:val="000000"/>
               </w:rPr>
-              <w:t xml:space="preserve">71</w:t>
+              <w:t xml:space="preserve">69</w:t>
             </w:r>
           </w:p>
         </w:tc>
@@ -11945,7 +11945,7 @@
                 <w:szCs w:val="18"/>
                 <w:color w:val="000000"/>
               </w:rPr>
-              <w:t xml:space="preserve">0.43 (0.23–0.83)</w:t>
+              <w:t xml:space="preserve">0.54 (0.28–1.05)</w:t>
             </w:r>
           </w:p>
         </w:tc>
@@ -12000,7 +12000,7 @@
                 <w:szCs w:val="18"/>
                 <w:color w:val="000000"/>
               </w:rPr>
-              <w:t xml:space="preserve">0.012</w:t>
+              <w:t xml:space="preserve">0.069</w:t>
             </w:r>
           </w:p>
         </w:tc>

</xml_diff>